<commit_message>
content(cv): employer logo strip on front page (#15)
Adds a compact logo band under the Positions table: ACMA, FDAS,
AceEngineer, Oxy, 2H Offshore. Logos sourced from public sites
(acma-inc.com, Wikimedia Commons OXY_LOGO, 2hoffshore.com CDN) and own
brand assets (AceEngineer, FDAS). build_pages.py now copies
cv/assets/logos into the public site assets. Page 1 still self-contained
(highlights trimmed, tighter spacing); artifacts regenerated, 4-page PDF.

Co-Authored-By: Claude Fable 5 <noreply@anthropic.com>
</commit_message>
<xml_diff>
--- a/cv/va_resume.docx
+++ b/cv/va_resume.docx
@@ -697,12 +697,222 @@
       <w:pPr>
         <w:pStyle w:val="BodyText"/>
         <w:bidi w:val="0"/>
-        <w:jc w:val="left"/>
-        <w:rPr/>
-      </w:pPr>
-      <w:r>
-        <w:rPr/>
-        <w:t>Roles from 2012 onward include concurrent engagements — the consulting practice and venture roles run in parallel with client positions. Project-level detail for each position follows on the next pages.</w:t>
+        <w:spacing w:before="60" w:after="60"/>
+        <w:ind w:hanging="0" w:left="60" w:right="60"/>
+        <w:jc w:val="left"/>
+        <w:rPr/>
+      </w:pPr>
+      <w:r>
+        <w:rPr/>
+        <w:drawing>
+          <wp:inline distT="0" distB="0" distL="0" distR="0">
+            <wp:extent cx="3571875" cy="2095500"/>
+            <wp:effectExtent l="0" t="0" r="0" b="0"/>
+            <wp:docPr id="1" name="Image1" descr="Alan C. McClure Associates"/>
+            <wp:cNvGraphicFramePr>
+              <a:graphicFrameLocks xmlns:a="http://schemas.openxmlformats.org/drawingml/2006/main" noChangeAspect="1"/>
+            </wp:cNvGraphicFramePr>
+            <a:graphic xmlns:a="http://schemas.openxmlformats.org/drawingml/2006/main">
+              <a:graphicData uri="http://schemas.openxmlformats.org/drawingml/2006/picture">
+                <pic:pic xmlns:pic="http://schemas.openxmlformats.org/drawingml/2006/picture">
+                  <pic:nvPicPr>
+                    <pic:cNvPr id="1" name="Image1" descr="Alan C. McClure Associates"/>
+                    <pic:cNvPicPr>
+                      <a:picLocks noChangeAspect="1" noChangeArrowheads="1"/>
+                    </pic:cNvPicPr>
+                  </pic:nvPicPr>
+                  <pic:blipFill>
+                    <a:blip r:link="rId4"/>
+                    <a:stretch>
+                      <a:fillRect/>
+                    </a:stretch>
+                  </pic:blipFill>
+                  <pic:spPr bwMode="auto">
+                    <a:xfrm>
+                      <a:off x="0" y="0"/>
+                      <a:ext cx="3571875" cy="2095500"/>
+                    </a:xfrm>
+                    <a:prstGeom prst="rect">
+                      <a:avLst/>
+                    </a:prstGeom>
+                  </pic:spPr>
+                </pic:pic>
+              </a:graphicData>
+            </a:graphic>
+          </wp:inline>
+        </w:drawing>
+      </w:r>
+      <w:r>
+        <w:rPr/>
+        <w:drawing>
+          <wp:inline distT="0" distB="0" distL="0" distR="0">
+            <wp:extent cx="9772650" cy="2286000"/>
+            <wp:effectExtent l="0" t="0" r="0" b="0"/>
+            <wp:docPr id="2" name="Image2" descr="Frontier Deepwater Appraisal Solutions"/>
+            <wp:cNvGraphicFramePr>
+              <a:graphicFrameLocks xmlns:a="http://schemas.openxmlformats.org/drawingml/2006/main" noChangeAspect="1"/>
+            </wp:cNvGraphicFramePr>
+            <a:graphic xmlns:a="http://schemas.openxmlformats.org/drawingml/2006/main">
+              <a:graphicData uri="http://schemas.openxmlformats.org/drawingml/2006/picture">
+                <pic:pic xmlns:pic="http://schemas.openxmlformats.org/drawingml/2006/picture">
+                  <pic:nvPicPr>
+                    <pic:cNvPr id="2" name="Image2" descr="Frontier Deepwater Appraisal Solutions"/>
+                    <pic:cNvPicPr>
+                      <a:picLocks noChangeAspect="1" noChangeArrowheads="1"/>
+                    </pic:cNvPicPr>
+                  </pic:nvPicPr>
+                  <pic:blipFill>
+                    <a:blip r:link="rId5"/>
+                    <a:stretch>
+                      <a:fillRect/>
+                    </a:stretch>
+                  </pic:blipFill>
+                  <pic:spPr bwMode="auto">
+                    <a:xfrm>
+                      <a:off x="0" y="0"/>
+                      <a:ext cx="9772650" cy="2286000"/>
+                    </a:xfrm>
+                    <a:prstGeom prst="rect">
+                      <a:avLst/>
+                    </a:prstGeom>
+                  </pic:spPr>
+                </pic:pic>
+              </a:graphicData>
+            </a:graphic>
+          </wp:inline>
+        </w:drawing>
+      </w:r>
+      <w:r>
+        <w:rPr/>
+        <w:drawing>
+          <wp:inline distT="0" distB="0" distL="0" distR="0">
+            <wp:extent cx="6105525" cy="1533525"/>
+            <wp:effectExtent l="0" t="0" r="0" b="0"/>
+            <wp:docPr id="3" name="Image3" descr="AceEngineer logo&#10;AceEngineer wordmark with angular engineering mark in plum and copper."/>
+            <wp:cNvGraphicFramePr>
+              <a:graphicFrameLocks xmlns:a="http://schemas.openxmlformats.org/drawingml/2006/main" noChangeAspect="1"/>
+            </wp:cNvGraphicFramePr>
+            <a:graphic xmlns:a="http://schemas.openxmlformats.org/drawingml/2006/main">
+              <a:graphicData uri="http://schemas.openxmlformats.org/drawingml/2006/picture">
+                <pic:pic xmlns:pic="http://schemas.openxmlformats.org/drawingml/2006/picture">
+                  <pic:nvPicPr>
+                    <pic:cNvPr id="3" name="Image3" descr="AceEngineer logo&#10;AceEngineer wordmark with angular engineering mark in plum and copper."/>
+                    <pic:cNvPicPr>
+                      <a:picLocks noChangeAspect="1" noChangeArrowheads="1"/>
+                    </pic:cNvPicPr>
+                  </pic:nvPicPr>
+                  <pic:blipFill>
+                    <a:blip r:link="rId6"/>
+                    <a:stretch>
+                      <a:fillRect/>
+                    </a:stretch>
+                  </pic:blipFill>
+                  <pic:spPr bwMode="auto">
+                    <a:xfrm>
+                      <a:off x="0" y="0"/>
+                      <a:ext cx="6105525" cy="1533525"/>
+                    </a:xfrm>
+                    <a:prstGeom prst="rect">
+                      <a:avLst/>
+                    </a:prstGeom>
+                  </pic:spPr>
+                </pic:pic>
+              </a:graphicData>
+            </a:graphic>
+          </wp:inline>
+        </w:drawing>
+      </w:r>
+      <w:r>
+        <w:rPr/>
+        <w:drawing>
+          <wp:inline distT="0" distB="0" distL="0" distR="0">
+            <wp:extent cx="7244715" cy="7427595"/>
+            <wp:effectExtent l="0" t="0" r="0" b="0"/>
+            <wp:docPr id="4" name="Image4" descr="Occidental Petroleum (Oxy)"/>
+            <wp:cNvGraphicFramePr>
+              <a:graphicFrameLocks xmlns:a="http://schemas.openxmlformats.org/drawingml/2006/main" noChangeAspect="1"/>
+            </wp:cNvGraphicFramePr>
+            <a:graphic xmlns:a="http://schemas.openxmlformats.org/drawingml/2006/main">
+              <a:graphicData uri="http://schemas.openxmlformats.org/drawingml/2006/picture">
+                <pic:pic xmlns:pic="http://schemas.openxmlformats.org/drawingml/2006/picture">
+                  <pic:nvPicPr>
+                    <pic:cNvPr id="4" name="Image4" descr="Occidental Petroleum (Oxy)"/>
+                    <pic:cNvPicPr>
+                      <a:picLocks noChangeAspect="1" noChangeArrowheads="1"/>
+                    </pic:cNvPicPr>
+                  </pic:nvPicPr>
+                  <pic:blipFill>
+                    <a:blip r:link="rId7"/>
+                    <a:stretch>
+                      <a:fillRect/>
+                    </a:stretch>
+                  </pic:blipFill>
+                  <pic:spPr bwMode="auto">
+                    <a:xfrm>
+                      <a:off x="0" y="0"/>
+                      <a:ext cx="7244715" cy="7427595"/>
+                    </a:xfrm>
+                    <a:prstGeom prst="rect">
+                      <a:avLst/>
+                    </a:prstGeom>
+                  </pic:spPr>
+                </pic:pic>
+              </a:graphicData>
+            </a:graphic>
+          </wp:inline>
+        </w:drawing>
+      </w:r>
+      <w:r>
+        <w:rPr/>
+        <w:drawing>
+          <wp:inline distT="0" distB="0" distL="0" distR="0">
+            <wp:extent cx="752475" cy="447675"/>
+            <wp:effectExtent l="0" t="0" r="0" b="0"/>
+            <wp:docPr id="5" name="Image5" descr="2H Offshore"/>
+            <wp:cNvGraphicFramePr>
+              <a:graphicFrameLocks xmlns:a="http://schemas.openxmlformats.org/drawingml/2006/main" noChangeAspect="1"/>
+            </wp:cNvGraphicFramePr>
+            <a:graphic xmlns:a="http://schemas.openxmlformats.org/drawingml/2006/main">
+              <a:graphicData uri="http://schemas.openxmlformats.org/drawingml/2006/picture">
+                <pic:pic xmlns:pic="http://schemas.openxmlformats.org/drawingml/2006/picture">
+                  <pic:nvPicPr>
+                    <pic:cNvPr id="5" name="Image5" descr="2H Offshore"/>
+                    <pic:cNvPicPr>
+                      <a:picLocks noChangeAspect="1" noChangeArrowheads="1"/>
+                    </pic:cNvPicPr>
+                  </pic:nvPicPr>
+                  <pic:blipFill>
+                    <a:blip r:link="rId8"/>
+                    <a:stretch>
+                      <a:fillRect/>
+                    </a:stretch>
+                  </pic:blipFill>
+                  <pic:spPr bwMode="auto">
+                    <a:xfrm>
+                      <a:off x="0" y="0"/>
+                      <a:ext cx="752475" cy="447675"/>
+                    </a:xfrm>
+                    <a:prstGeom prst="rect">
+                      <a:avLst/>
+                    </a:prstGeom>
+                  </pic:spPr>
+                </pic:pic>
+              </a:graphicData>
+            </a:graphic>
+          </wp:inline>
+        </w:drawing>
+      </w:r>
+    </w:p>
+    <w:p>
+      <w:pPr>
+        <w:pStyle w:val="BodyText"/>
+        <w:bidi w:val="0"/>
+        <w:jc w:val="left"/>
+        <w:rPr/>
+      </w:pPr>
+      <w:r>
+        <w:rPr/>
+        <w:t>Roles from 2012 onward run concurrently; project-level detail for each position follows on the next pages.</w:t>
       </w:r>
     </w:p>
     <w:p>
@@ -742,7 +952,7 @@
       </w:r>
       <w:r>
         <w:rPr/>
-        <w:t xml:space="preserve"> Engineering Manager for BP Macondo containment riser response; delivered a complete containment riser design in 8 weeks versus a typical multi-year cycle by repurposing existing assets. </w:t>
+        <w:t xml:space="preserve"> Engineering Manager for BP Macondo containment riser response; delivered a complete containment riser design in 8 weeks by repurposing existing assets. </w:t>
       </w:r>
     </w:p>
     <w:p>
@@ -854,9 +1064,9 @@
       </w:r>
       <w:r>
         <w:rPr/>
-        <w:t xml:space="preserve"> Live public engineering tools — </w:t>
-      </w:r>
-      <w:hyperlink r:id="rId4">
+        <w:t xml:space="preserve"> Live public tools — </w:t>
+      </w:r>
+      <w:hyperlink r:id="rId9">
         <w:r>
           <w:rPr>
             <w:rStyle w:val="Hyperlink"/>
@@ -866,7 +1076,7 @@
       </w:hyperlink>
       <w:r>
         <w:rPr/>
-        <w:t xml:space="preserve"> (GoM field economics &amp; well analytics on BSEE data), digitalmodel (open offshore engineering library), Raw-to-Knowledge playbook — deterministic, unit-tested, provenance-traced. </w:t>
+        <w:t xml:space="preserve"> (GoM field economics &amp; well analytics on BSEE data) and digitalmodel (open offshore engineering library) — deterministic, unit-tested, provenance-traced. </w:t>
       </w:r>
     </w:p>
     <w:p>
@@ -1736,7 +1946,7 @@
         <w:rPr/>
         <w:t xml:space="preserve"> Built and shipped public, deterministic engineering sites and libraries — </w:t>
       </w:r>
-      <w:hyperlink r:id="rId5">
+      <w:hyperlink r:id="rId10">
         <w:r>
           <w:rPr>
             <w:rStyle w:val="Hyperlink"/>
@@ -3883,8 +4093,8 @@
     <w:qFormat/>
     <w:pPr>
       <w:keepNext w:val="true"/>
-      <w:spacing w:before="150" w:after="120"/>
-      <w:ind w:left="150" w:right="150"/>
+      <w:spacing w:before="120" w:after="45"/>
+      <w:ind w:left="120" w:right="120"/>
       <w:outlineLvl w:val="1"/>
     </w:pPr>
     <w:rPr>

</xml_diff>

<commit_message>
content(cv): employer logo strip on front page (#15) (#24)
Adds a compact logo band under the Positions table: ACMA, FDAS,
AceEngineer, Oxy, 2H Offshore. Logos sourced from public sites
(acma-inc.com, Wikimedia Commons OXY_LOGO, 2hoffshore.com CDN) and own
brand assets (AceEngineer, FDAS). build_pages.py now copies
cv/assets/logos into the public site assets. Page 1 still self-contained
(highlights trimmed, tighter spacing); artifacts regenerated, 4-page PDF.

Co-authored-by: Claude Fable 5 <noreply@anthropic.com>
</commit_message>
<xml_diff>
--- a/cv/va_resume.docx
+++ b/cv/va_resume.docx
@@ -697,12 +697,222 @@
       <w:pPr>
         <w:pStyle w:val="BodyText"/>
         <w:bidi w:val="0"/>
-        <w:jc w:val="left"/>
-        <w:rPr/>
-      </w:pPr>
-      <w:r>
-        <w:rPr/>
-        <w:t>Roles from 2012 onward include concurrent engagements — the consulting practice and venture roles run in parallel with client positions. Project-level detail for each position follows on the next pages.</w:t>
+        <w:spacing w:before="60" w:after="60"/>
+        <w:ind w:hanging="0" w:left="60" w:right="60"/>
+        <w:jc w:val="left"/>
+        <w:rPr/>
+      </w:pPr>
+      <w:r>
+        <w:rPr/>
+        <w:drawing>
+          <wp:inline distT="0" distB="0" distL="0" distR="0">
+            <wp:extent cx="3571875" cy="2095500"/>
+            <wp:effectExtent l="0" t="0" r="0" b="0"/>
+            <wp:docPr id="1" name="Image1" descr="Alan C. McClure Associates"/>
+            <wp:cNvGraphicFramePr>
+              <a:graphicFrameLocks xmlns:a="http://schemas.openxmlformats.org/drawingml/2006/main" noChangeAspect="1"/>
+            </wp:cNvGraphicFramePr>
+            <a:graphic xmlns:a="http://schemas.openxmlformats.org/drawingml/2006/main">
+              <a:graphicData uri="http://schemas.openxmlformats.org/drawingml/2006/picture">
+                <pic:pic xmlns:pic="http://schemas.openxmlformats.org/drawingml/2006/picture">
+                  <pic:nvPicPr>
+                    <pic:cNvPr id="1" name="Image1" descr="Alan C. McClure Associates"/>
+                    <pic:cNvPicPr>
+                      <a:picLocks noChangeAspect="1" noChangeArrowheads="1"/>
+                    </pic:cNvPicPr>
+                  </pic:nvPicPr>
+                  <pic:blipFill>
+                    <a:blip r:link="rId4"/>
+                    <a:stretch>
+                      <a:fillRect/>
+                    </a:stretch>
+                  </pic:blipFill>
+                  <pic:spPr bwMode="auto">
+                    <a:xfrm>
+                      <a:off x="0" y="0"/>
+                      <a:ext cx="3571875" cy="2095500"/>
+                    </a:xfrm>
+                    <a:prstGeom prst="rect">
+                      <a:avLst/>
+                    </a:prstGeom>
+                  </pic:spPr>
+                </pic:pic>
+              </a:graphicData>
+            </a:graphic>
+          </wp:inline>
+        </w:drawing>
+      </w:r>
+      <w:r>
+        <w:rPr/>
+        <w:drawing>
+          <wp:inline distT="0" distB="0" distL="0" distR="0">
+            <wp:extent cx="9772650" cy="2286000"/>
+            <wp:effectExtent l="0" t="0" r="0" b="0"/>
+            <wp:docPr id="2" name="Image2" descr="Frontier Deepwater Appraisal Solutions"/>
+            <wp:cNvGraphicFramePr>
+              <a:graphicFrameLocks xmlns:a="http://schemas.openxmlformats.org/drawingml/2006/main" noChangeAspect="1"/>
+            </wp:cNvGraphicFramePr>
+            <a:graphic xmlns:a="http://schemas.openxmlformats.org/drawingml/2006/main">
+              <a:graphicData uri="http://schemas.openxmlformats.org/drawingml/2006/picture">
+                <pic:pic xmlns:pic="http://schemas.openxmlformats.org/drawingml/2006/picture">
+                  <pic:nvPicPr>
+                    <pic:cNvPr id="2" name="Image2" descr="Frontier Deepwater Appraisal Solutions"/>
+                    <pic:cNvPicPr>
+                      <a:picLocks noChangeAspect="1" noChangeArrowheads="1"/>
+                    </pic:cNvPicPr>
+                  </pic:nvPicPr>
+                  <pic:blipFill>
+                    <a:blip r:link="rId5"/>
+                    <a:stretch>
+                      <a:fillRect/>
+                    </a:stretch>
+                  </pic:blipFill>
+                  <pic:spPr bwMode="auto">
+                    <a:xfrm>
+                      <a:off x="0" y="0"/>
+                      <a:ext cx="9772650" cy="2286000"/>
+                    </a:xfrm>
+                    <a:prstGeom prst="rect">
+                      <a:avLst/>
+                    </a:prstGeom>
+                  </pic:spPr>
+                </pic:pic>
+              </a:graphicData>
+            </a:graphic>
+          </wp:inline>
+        </w:drawing>
+      </w:r>
+      <w:r>
+        <w:rPr/>
+        <w:drawing>
+          <wp:inline distT="0" distB="0" distL="0" distR="0">
+            <wp:extent cx="6105525" cy="1533525"/>
+            <wp:effectExtent l="0" t="0" r="0" b="0"/>
+            <wp:docPr id="3" name="Image3" descr="AceEngineer logo&#10;AceEngineer wordmark with angular engineering mark in plum and copper."/>
+            <wp:cNvGraphicFramePr>
+              <a:graphicFrameLocks xmlns:a="http://schemas.openxmlformats.org/drawingml/2006/main" noChangeAspect="1"/>
+            </wp:cNvGraphicFramePr>
+            <a:graphic xmlns:a="http://schemas.openxmlformats.org/drawingml/2006/main">
+              <a:graphicData uri="http://schemas.openxmlformats.org/drawingml/2006/picture">
+                <pic:pic xmlns:pic="http://schemas.openxmlformats.org/drawingml/2006/picture">
+                  <pic:nvPicPr>
+                    <pic:cNvPr id="3" name="Image3" descr="AceEngineer logo&#10;AceEngineer wordmark with angular engineering mark in plum and copper."/>
+                    <pic:cNvPicPr>
+                      <a:picLocks noChangeAspect="1" noChangeArrowheads="1"/>
+                    </pic:cNvPicPr>
+                  </pic:nvPicPr>
+                  <pic:blipFill>
+                    <a:blip r:link="rId6"/>
+                    <a:stretch>
+                      <a:fillRect/>
+                    </a:stretch>
+                  </pic:blipFill>
+                  <pic:spPr bwMode="auto">
+                    <a:xfrm>
+                      <a:off x="0" y="0"/>
+                      <a:ext cx="6105525" cy="1533525"/>
+                    </a:xfrm>
+                    <a:prstGeom prst="rect">
+                      <a:avLst/>
+                    </a:prstGeom>
+                  </pic:spPr>
+                </pic:pic>
+              </a:graphicData>
+            </a:graphic>
+          </wp:inline>
+        </w:drawing>
+      </w:r>
+      <w:r>
+        <w:rPr/>
+        <w:drawing>
+          <wp:inline distT="0" distB="0" distL="0" distR="0">
+            <wp:extent cx="7244715" cy="7427595"/>
+            <wp:effectExtent l="0" t="0" r="0" b="0"/>
+            <wp:docPr id="4" name="Image4" descr="Occidental Petroleum (Oxy)"/>
+            <wp:cNvGraphicFramePr>
+              <a:graphicFrameLocks xmlns:a="http://schemas.openxmlformats.org/drawingml/2006/main" noChangeAspect="1"/>
+            </wp:cNvGraphicFramePr>
+            <a:graphic xmlns:a="http://schemas.openxmlformats.org/drawingml/2006/main">
+              <a:graphicData uri="http://schemas.openxmlformats.org/drawingml/2006/picture">
+                <pic:pic xmlns:pic="http://schemas.openxmlformats.org/drawingml/2006/picture">
+                  <pic:nvPicPr>
+                    <pic:cNvPr id="4" name="Image4" descr="Occidental Petroleum (Oxy)"/>
+                    <pic:cNvPicPr>
+                      <a:picLocks noChangeAspect="1" noChangeArrowheads="1"/>
+                    </pic:cNvPicPr>
+                  </pic:nvPicPr>
+                  <pic:blipFill>
+                    <a:blip r:link="rId7"/>
+                    <a:stretch>
+                      <a:fillRect/>
+                    </a:stretch>
+                  </pic:blipFill>
+                  <pic:spPr bwMode="auto">
+                    <a:xfrm>
+                      <a:off x="0" y="0"/>
+                      <a:ext cx="7244715" cy="7427595"/>
+                    </a:xfrm>
+                    <a:prstGeom prst="rect">
+                      <a:avLst/>
+                    </a:prstGeom>
+                  </pic:spPr>
+                </pic:pic>
+              </a:graphicData>
+            </a:graphic>
+          </wp:inline>
+        </w:drawing>
+      </w:r>
+      <w:r>
+        <w:rPr/>
+        <w:drawing>
+          <wp:inline distT="0" distB="0" distL="0" distR="0">
+            <wp:extent cx="752475" cy="447675"/>
+            <wp:effectExtent l="0" t="0" r="0" b="0"/>
+            <wp:docPr id="5" name="Image5" descr="2H Offshore"/>
+            <wp:cNvGraphicFramePr>
+              <a:graphicFrameLocks xmlns:a="http://schemas.openxmlformats.org/drawingml/2006/main" noChangeAspect="1"/>
+            </wp:cNvGraphicFramePr>
+            <a:graphic xmlns:a="http://schemas.openxmlformats.org/drawingml/2006/main">
+              <a:graphicData uri="http://schemas.openxmlformats.org/drawingml/2006/picture">
+                <pic:pic xmlns:pic="http://schemas.openxmlformats.org/drawingml/2006/picture">
+                  <pic:nvPicPr>
+                    <pic:cNvPr id="5" name="Image5" descr="2H Offshore"/>
+                    <pic:cNvPicPr>
+                      <a:picLocks noChangeAspect="1" noChangeArrowheads="1"/>
+                    </pic:cNvPicPr>
+                  </pic:nvPicPr>
+                  <pic:blipFill>
+                    <a:blip r:link="rId8"/>
+                    <a:stretch>
+                      <a:fillRect/>
+                    </a:stretch>
+                  </pic:blipFill>
+                  <pic:spPr bwMode="auto">
+                    <a:xfrm>
+                      <a:off x="0" y="0"/>
+                      <a:ext cx="752475" cy="447675"/>
+                    </a:xfrm>
+                    <a:prstGeom prst="rect">
+                      <a:avLst/>
+                    </a:prstGeom>
+                  </pic:spPr>
+                </pic:pic>
+              </a:graphicData>
+            </a:graphic>
+          </wp:inline>
+        </w:drawing>
+      </w:r>
+    </w:p>
+    <w:p>
+      <w:pPr>
+        <w:pStyle w:val="BodyText"/>
+        <w:bidi w:val="0"/>
+        <w:jc w:val="left"/>
+        <w:rPr/>
+      </w:pPr>
+      <w:r>
+        <w:rPr/>
+        <w:t>Roles from 2012 onward run concurrently; project-level detail for each position follows on the next pages.</w:t>
       </w:r>
     </w:p>
     <w:p>
@@ -742,7 +952,7 @@
       </w:r>
       <w:r>
         <w:rPr/>
-        <w:t xml:space="preserve"> Engineering Manager for BP Macondo containment riser response; delivered a complete containment riser design in 8 weeks versus a typical multi-year cycle by repurposing existing assets. </w:t>
+        <w:t xml:space="preserve"> Engineering Manager for BP Macondo containment riser response; delivered a complete containment riser design in 8 weeks by repurposing existing assets. </w:t>
       </w:r>
     </w:p>
     <w:p>
@@ -854,9 +1064,9 @@
       </w:r>
       <w:r>
         <w:rPr/>
-        <w:t xml:space="preserve"> Live public engineering tools — </w:t>
-      </w:r>
-      <w:hyperlink r:id="rId4">
+        <w:t xml:space="preserve"> Live public tools — </w:t>
+      </w:r>
+      <w:hyperlink r:id="rId9">
         <w:r>
           <w:rPr>
             <w:rStyle w:val="Hyperlink"/>
@@ -866,7 +1076,7 @@
       </w:hyperlink>
       <w:r>
         <w:rPr/>
-        <w:t xml:space="preserve"> (GoM field economics &amp; well analytics on BSEE data), digitalmodel (open offshore engineering library), Raw-to-Knowledge playbook — deterministic, unit-tested, provenance-traced. </w:t>
+        <w:t xml:space="preserve"> (GoM field economics &amp; well analytics on BSEE data) and digitalmodel (open offshore engineering library) — deterministic, unit-tested, provenance-traced. </w:t>
       </w:r>
     </w:p>
     <w:p>
@@ -1736,7 +1946,7 @@
         <w:rPr/>
         <w:t xml:space="preserve"> Built and shipped public, deterministic engineering sites and libraries — </w:t>
       </w:r>
-      <w:hyperlink r:id="rId5">
+      <w:hyperlink r:id="rId10">
         <w:r>
           <w:rPr>
             <w:rStyle w:val="Hyperlink"/>
@@ -3883,8 +4093,8 @@
     <w:qFormat/>
     <w:pPr>
       <w:keepNext w:val="true"/>
-      <w:spacing w:before="150" w:after="120"/>
-      <w:ind w:left="150" w:right="150"/>
+      <w:spacing w:before="120" w:after="45"/>
+      <w:ind w:left="120" w:right="120"/>
       <w:outlineLvl w:val="1"/>
     </w:pPr>
     <w:rPr>

</xml_diff>

<commit_message>
content(cv): ecosystem additions — Deckhand, CFD, floating wind, HSE analytics (#15)
Page 1: portfolio (career-site) link in header; Deckhand platform
highlight replaces generic digital-transformation bullet; standards
bullet folded into open-engineering line (was duplicating the
credentials block). Detail pages: CFD competency line (validated
OpenFOAM suite), floating-wind sizing, DNV operability standards,
Deckhand API + AI-augmented-operations + HSE-analytics bullets under
AceEngineer, quantified digitalmodel, Deckhand/CFD portfolio entries.
Landing page gains Deckhand demo-gallery card. PDFs regenerated (5pp,
page 1 self-contained).

Co-Authored-By: Claude Fable 5 <noreply@anthropic.com>
</commit_message>
<xml_diff>
--- a/cv/va_resume.docx
+++ b/cv/va_resume.docx
@@ -52,7 +52,7 @@
       </w:r>
       <w:r>
         <w:rPr/>
-        <w:t xml:space="preserve"> 713-306-9029</w:t>
+        <w:t xml:space="preserve"> 713-306-9029 | Houston, TX</w:t>
         <w:br/>
       </w:r>
       <w:r>
@@ -103,12 +103,20 @@
         <w:rPr>
           <w:rStyle w:val="Strong"/>
         </w:rPr>
-        <w:t>Location:</w:t>
-      </w:r>
-      <w:r>
-        <w:rPr/>
-        <w:t xml:space="preserve"> Houston, TX</w:t>
-      </w:r>
+        <w:t>Portfolio:</w:t>
+      </w:r>
+      <w:r>
+        <w:rPr/>
+        <w:t xml:space="preserve"> </w:t>
+      </w:r>
+      <w:hyperlink r:id="rId4">
+        <w:r>
+          <w:rPr>
+            <w:rStyle w:val="Hyperlink"/>
+          </w:rPr>
+          <w:t>career site</w:t>
+        </w:r>
+      </w:hyperlink>
     </w:p>
     <w:p>
       <w:pPr>
@@ -183,10 +191,10 @@
         </w:tblCellMar>
       </w:tblPr>
       <w:tblGrid>
-        <w:gridCol w:w="1420"/>
-        <w:gridCol w:w="2222"/>
-        <w:gridCol w:w="3074"/>
-        <w:gridCol w:w="4623"/>
+        <w:gridCol w:w="1431"/>
+        <w:gridCol w:w="2228"/>
+        <w:gridCol w:w="3073"/>
+        <w:gridCol w:w="4607"/>
       </w:tblGrid>
       <w:tr>
         <w:trPr>
@@ -194,7 +202,7 @@
         </w:trPr>
         <w:tc>
           <w:tcPr>
-            <w:tcW w:w="1420" w:type="dxa"/>
+            <w:tcW w:w="1431" w:type="dxa"/>
             <w:tcBorders/>
             <w:vAlign w:val="center"/>
           </w:tcPr>
@@ -203,7 +211,7 @@
               <w:pStyle w:val="TableHeading"/>
               <w:suppressLineNumbers/>
               <w:bidi w:val="0"/>
-              <w:spacing w:before="45" w:after="75"/>
+              <w:spacing w:before="60" w:after="60"/>
               <w:jc w:val="left"/>
               <w:rPr/>
             </w:pPr>
@@ -215,7 +223,7 @@
         </w:tc>
         <w:tc>
           <w:tcPr>
-            <w:tcW w:w="2222" w:type="dxa"/>
+            <w:tcW w:w="2228" w:type="dxa"/>
             <w:tcBorders/>
             <w:vAlign w:val="center"/>
           </w:tcPr>
@@ -224,7 +232,7 @@
               <w:pStyle w:val="TableHeading"/>
               <w:suppressLineNumbers/>
               <w:bidi w:val="0"/>
-              <w:spacing w:before="45" w:after="75"/>
+              <w:spacing w:before="60" w:after="60"/>
               <w:jc w:val="left"/>
               <w:rPr/>
             </w:pPr>
@@ -236,7 +244,7 @@
         </w:tc>
         <w:tc>
           <w:tcPr>
-            <w:tcW w:w="3074" w:type="dxa"/>
+            <w:tcW w:w="3073" w:type="dxa"/>
             <w:tcBorders/>
             <w:vAlign w:val="center"/>
           </w:tcPr>
@@ -245,7 +253,7 @@
               <w:pStyle w:val="TableHeading"/>
               <w:suppressLineNumbers/>
               <w:bidi w:val="0"/>
-              <w:spacing w:before="45" w:after="75"/>
+              <w:spacing w:before="60" w:after="60"/>
               <w:jc w:val="left"/>
               <w:rPr/>
             </w:pPr>
@@ -257,7 +265,7 @@
         </w:tc>
         <w:tc>
           <w:tcPr>
-            <w:tcW w:w="4623" w:type="dxa"/>
+            <w:tcW w:w="4607" w:type="dxa"/>
             <w:tcBorders/>
             <w:vAlign w:val="center"/>
           </w:tcPr>
@@ -266,7 +274,7 @@
               <w:pStyle w:val="TableHeading"/>
               <w:suppressLineNumbers/>
               <w:bidi w:val="0"/>
-              <w:spacing w:before="45" w:after="75"/>
+              <w:spacing w:before="60" w:after="60"/>
               <w:jc w:val="left"/>
               <w:rPr/>
             </w:pPr>
@@ -281,7 +289,7 @@
         <w:trPr/>
         <w:tc>
           <w:tcPr>
-            <w:tcW w:w="1420" w:type="dxa"/>
+            <w:tcW w:w="1431" w:type="dxa"/>
             <w:tcBorders/>
             <w:vAlign w:val="center"/>
           </w:tcPr>
@@ -289,7 +297,7 @@
             <w:pPr>
               <w:pStyle w:val="TableContents"/>
               <w:bidi w:val="0"/>
-              <w:spacing w:before="45" w:after="75"/>
+              <w:spacing w:before="60" w:after="60"/>
               <w:jc w:val="left"/>
               <w:rPr/>
             </w:pPr>
@@ -301,7 +309,7 @@
         </w:tc>
         <w:tc>
           <w:tcPr>
-            <w:tcW w:w="2222" w:type="dxa"/>
+            <w:tcW w:w="2228" w:type="dxa"/>
             <w:tcBorders/>
             <w:vAlign w:val="center"/>
           </w:tcPr>
@@ -309,7 +317,7 @@
             <w:pPr>
               <w:pStyle w:val="TableContents"/>
               <w:bidi w:val="0"/>
-              <w:spacing w:before="45" w:after="75"/>
+              <w:spacing w:before="60" w:after="60"/>
               <w:jc w:val="left"/>
               <w:rPr/>
             </w:pPr>
@@ -321,7 +329,7 @@
         </w:tc>
         <w:tc>
           <w:tcPr>
-            <w:tcW w:w="3074" w:type="dxa"/>
+            <w:tcW w:w="3073" w:type="dxa"/>
             <w:tcBorders/>
             <w:vAlign w:val="center"/>
           </w:tcPr>
@@ -329,7 +337,7 @@
             <w:pPr>
               <w:pStyle w:val="TableContents"/>
               <w:bidi w:val="0"/>
-              <w:spacing w:before="45" w:after="75"/>
+              <w:spacing w:before="60" w:after="60"/>
               <w:jc w:val="left"/>
               <w:rPr/>
             </w:pPr>
@@ -341,7 +349,7 @@
         </w:tc>
         <w:tc>
           <w:tcPr>
-            <w:tcW w:w="4623" w:type="dxa"/>
+            <w:tcW w:w="4607" w:type="dxa"/>
             <w:tcBorders/>
             <w:vAlign w:val="center"/>
           </w:tcPr>
@@ -349,7 +357,7 @@
             <w:pPr>
               <w:pStyle w:val="TableContents"/>
               <w:bidi w:val="0"/>
-              <w:spacing w:before="45" w:after="75"/>
+              <w:spacing w:before="60" w:after="60"/>
               <w:jc w:val="left"/>
               <w:rPr/>
             </w:pPr>
@@ -364,7 +372,7 @@
         <w:trPr/>
         <w:tc>
           <w:tcPr>
-            <w:tcW w:w="1420" w:type="dxa"/>
+            <w:tcW w:w="1431" w:type="dxa"/>
             <w:tcBorders/>
             <w:vAlign w:val="center"/>
           </w:tcPr>
@@ -372,7 +380,7 @@
             <w:pPr>
               <w:pStyle w:val="TableContents"/>
               <w:bidi w:val="0"/>
-              <w:spacing w:before="45" w:after="75"/>
+              <w:spacing w:before="60" w:after="60"/>
               <w:jc w:val="left"/>
               <w:rPr/>
             </w:pPr>
@@ -384,7 +392,7 @@
         </w:tc>
         <w:tc>
           <w:tcPr>
-            <w:tcW w:w="2222" w:type="dxa"/>
+            <w:tcW w:w="2228" w:type="dxa"/>
             <w:tcBorders/>
             <w:vAlign w:val="center"/>
           </w:tcPr>
@@ -392,7 +400,7 @@
             <w:pPr>
               <w:pStyle w:val="TableContents"/>
               <w:bidi w:val="0"/>
-              <w:spacing w:before="45" w:after="75"/>
+              <w:spacing w:before="60" w:after="60"/>
               <w:jc w:val="left"/>
               <w:rPr/>
             </w:pPr>
@@ -404,7 +412,7 @@
         </w:tc>
         <w:tc>
           <w:tcPr>
-            <w:tcW w:w="3074" w:type="dxa"/>
+            <w:tcW w:w="3073" w:type="dxa"/>
             <w:tcBorders/>
             <w:vAlign w:val="center"/>
           </w:tcPr>
@@ -412,7 +420,7 @@
             <w:pPr>
               <w:pStyle w:val="TableContents"/>
               <w:bidi w:val="0"/>
-              <w:spacing w:before="45" w:after="75"/>
+              <w:spacing w:before="60" w:after="60"/>
               <w:jc w:val="left"/>
               <w:rPr/>
             </w:pPr>
@@ -424,7 +432,7 @@
         </w:tc>
         <w:tc>
           <w:tcPr>
-            <w:tcW w:w="4623" w:type="dxa"/>
+            <w:tcW w:w="4607" w:type="dxa"/>
             <w:tcBorders/>
             <w:vAlign w:val="center"/>
           </w:tcPr>
@@ -432,7 +440,7 @@
             <w:pPr>
               <w:pStyle w:val="TableContents"/>
               <w:bidi w:val="0"/>
-              <w:spacing w:before="45" w:after="75"/>
+              <w:spacing w:before="60" w:after="60"/>
               <w:jc w:val="left"/>
               <w:rPr/>
             </w:pPr>
@@ -447,7 +455,7 @@
         <w:trPr/>
         <w:tc>
           <w:tcPr>
-            <w:tcW w:w="1420" w:type="dxa"/>
+            <w:tcW w:w="1431" w:type="dxa"/>
             <w:tcBorders/>
             <w:vAlign w:val="center"/>
           </w:tcPr>
@@ -455,7 +463,7 @@
             <w:pPr>
               <w:pStyle w:val="TableContents"/>
               <w:bidi w:val="0"/>
-              <w:spacing w:before="45" w:after="75"/>
+              <w:spacing w:before="60" w:after="60"/>
               <w:jc w:val="left"/>
               <w:rPr/>
             </w:pPr>
@@ -467,7 +475,7 @@
         </w:tc>
         <w:tc>
           <w:tcPr>
-            <w:tcW w:w="2222" w:type="dxa"/>
+            <w:tcW w:w="2228" w:type="dxa"/>
             <w:tcBorders/>
             <w:vAlign w:val="center"/>
           </w:tcPr>
@@ -475,7 +483,7 @@
             <w:pPr>
               <w:pStyle w:val="TableContents"/>
               <w:bidi w:val="0"/>
-              <w:spacing w:before="45" w:after="75"/>
+              <w:spacing w:before="60" w:after="60"/>
               <w:jc w:val="left"/>
               <w:rPr/>
             </w:pPr>
@@ -487,7 +495,7 @@
         </w:tc>
         <w:tc>
           <w:tcPr>
-            <w:tcW w:w="3074" w:type="dxa"/>
+            <w:tcW w:w="3073" w:type="dxa"/>
             <w:tcBorders/>
             <w:vAlign w:val="center"/>
           </w:tcPr>
@@ -495,7 +503,7 @@
             <w:pPr>
               <w:pStyle w:val="TableContents"/>
               <w:bidi w:val="0"/>
-              <w:spacing w:before="45" w:after="75"/>
+              <w:spacing w:before="60" w:after="60"/>
               <w:jc w:val="left"/>
               <w:rPr/>
             </w:pPr>
@@ -507,7 +515,7 @@
         </w:tc>
         <w:tc>
           <w:tcPr>
-            <w:tcW w:w="4623" w:type="dxa"/>
+            <w:tcW w:w="4607" w:type="dxa"/>
             <w:tcBorders/>
             <w:vAlign w:val="center"/>
           </w:tcPr>
@@ -515,7 +523,7 @@
             <w:pPr>
               <w:pStyle w:val="TableContents"/>
               <w:bidi w:val="0"/>
-              <w:spacing w:before="45" w:after="75"/>
+              <w:spacing w:before="60" w:after="60"/>
               <w:jc w:val="left"/>
               <w:rPr/>
             </w:pPr>
@@ -530,7 +538,7 @@
         <w:trPr/>
         <w:tc>
           <w:tcPr>
-            <w:tcW w:w="1420" w:type="dxa"/>
+            <w:tcW w:w="1431" w:type="dxa"/>
             <w:tcBorders/>
             <w:vAlign w:val="center"/>
           </w:tcPr>
@@ -538,7 +546,7 @@
             <w:pPr>
               <w:pStyle w:val="TableContents"/>
               <w:bidi w:val="0"/>
-              <w:spacing w:before="45" w:after="75"/>
+              <w:spacing w:before="60" w:after="60"/>
               <w:jc w:val="left"/>
               <w:rPr/>
             </w:pPr>
@@ -550,7 +558,7 @@
         </w:tc>
         <w:tc>
           <w:tcPr>
-            <w:tcW w:w="2222" w:type="dxa"/>
+            <w:tcW w:w="2228" w:type="dxa"/>
             <w:tcBorders/>
             <w:vAlign w:val="center"/>
           </w:tcPr>
@@ -558,7 +566,7 @@
             <w:pPr>
               <w:pStyle w:val="TableContents"/>
               <w:bidi w:val="0"/>
-              <w:spacing w:before="45" w:after="75"/>
+              <w:spacing w:before="60" w:after="60"/>
               <w:jc w:val="left"/>
               <w:rPr/>
             </w:pPr>
@@ -570,7 +578,7 @@
         </w:tc>
         <w:tc>
           <w:tcPr>
-            <w:tcW w:w="3074" w:type="dxa"/>
+            <w:tcW w:w="3073" w:type="dxa"/>
             <w:tcBorders/>
             <w:vAlign w:val="center"/>
           </w:tcPr>
@@ -578,7 +586,7 @@
             <w:pPr>
               <w:pStyle w:val="TableContents"/>
               <w:bidi w:val="0"/>
-              <w:spacing w:before="45" w:after="75"/>
+              <w:spacing w:before="60" w:after="60"/>
               <w:jc w:val="left"/>
               <w:rPr/>
             </w:pPr>
@@ -590,7 +598,7 @@
         </w:tc>
         <w:tc>
           <w:tcPr>
-            <w:tcW w:w="4623" w:type="dxa"/>
+            <w:tcW w:w="4607" w:type="dxa"/>
             <w:tcBorders/>
             <w:vAlign w:val="center"/>
           </w:tcPr>
@@ -598,7 +606,7 @@
             <w:pPr>
               <w:pStyle w:val="TableContents"/>
               <w:bidi w:val="0"/>
-              <w:spacing w:before="45" w:after="75"/>
+              <w:spacing w:before="60" w:after="60"/>
               <w:jc w:val="left"/>
               <w:rPr/>
             </w:pPr>
@@ -613,7 +621,7 @@
         <w:trPr/>
         <w:tc>
           <w:tcPr>
-            <w:tcW w:w="1420" w:type="dxa"/>
+            <w:tcW w:w="1431" w:type="dxa"/>
             <w:tcBorders/>
             <w:vAlign w:val="center"/>
           </w:tcPr>
@@ -621,7 +629,7 @@
             <w:pPr>
               <w:pStyle w:val="TableContents"/>
               <w:bidi w:val="0"/>
-              <w:spacing w:before="45" w:after="75"/>
+              <w:spacing w:before="60" w:after="60"/>
               <w:jc w:val="left"/>
               <w:rPr/>
             </w:pPr>
@@ -633,7 +641,7 @@
         </w:tc>
         <w:tc>
           <w:tcPr>
-            <w:tcW w:w="2222" w:type="dxa"/>
+            <w:tcW w:w="2228" w:type="dxa"/>
             <w:tcBorders/>
             <w:vAlign w:val="center"/>
           </w:tcPr>
@@ -641,7 +649,7 @@
             <w:pPr>
               <w:pStyle w:val="TableContents"/>
               <w:bidi w:val="0"/>
-              <w:spacing w:before="45" w:after="75"/>
+              <w:spacing w:before="60" w:after="60"/>
               <w:jc w:val="left"/>
               <w:rPr/>
             </w:pPr>
@@ -653,7 +661,7 @@
         </w:tc>
         <w:tc>
           <w:tcPr>
-            <w:tcW w:w="3074" w:type="dxa"/>
+            <w:tcW w:w="3073" w:type="dxa"/>
             <w:tcBorders/>
             <w:vAlign w:val="center"/>
           </w:tcPr>
@@ -661,7 +669,7 @@
             <w:pPr>
               <w:pStyle w:val="TableContents"/>
               <w:bidi w:val="0"/>
-              <w:spacing w:before="45" w:after="75"/>
+              <w:spacing w:before="60" w:after="60"/>
               <w:jc w:val="left"/>
               <w:rPr/>
             </w:pPr>
@@ -673,7 +681,7 @@
         </w:tc>
         <w:tc>
           <w:tcPr>
-            <w:tcW w:w="4623" w:type="dxa"/>
+            <w:tcW w:w="4607" w:type="dxa"/>
             <w:tcBorders/>
             <w:vAlign w:val="center"/>
           </w:tcPr>
@@ -681,7 +689,7 @@
             <w:pPr>
               <w:pStyle w:val="TableContents"/>
               <w:bidi w:val="0"/>
-              <w:spacing w:before="45" w:after="75"/>
+              <w:spacing w:before="60" w:after="60"/>
               <w:jc w:val="left"/>
               <w:rPr/>
             </w:pPr>
@@ -722,7 +730,7 @@
                     </pic:cNvPicPr>
                   </pic:nvPicPr>
                   <pic:blipFill>
-                    <a:blip r:link="rId4"/>
+                    <a:blip r:link="rId5"/>
                     <a:stretch>
                       <a:fillRect/>
                     </a:stretch>
@@ -762,7 +770,7 @@
                     </pic:cNvPicPr>
                   </pic:nvPicPr>
                   <pic:blipFill>
-                    <a:blip r:link="rId5"/>
+                    <a:blip r:link="rId6"/>
                     <a:stretch>
                       <a:fillRect/>
                     </a:stretch>
@@ -802,7 +810,7 @@
                     </pic:cNvPicPr>
                   </pic:nvPicPr>
                   <pic:blipFill>
-                    <a:blip r:link="rId6"/>
+                    <a:blip r:link="rId7"/>
                     <a:stretch>
                       <a:fillRect/>
                     </a:stretch>
@@ -842,7 +850,7 @@
                     </pic:cNvPicPr>
                   </pic:nvPicPr>
                   <pic:blipFill>
-                    <a:blip r:link="rId7"/>
+                    <a:blip r:link="rId8"/>
                     <a:stretch>
                       <a:fillRect/>
                     </a:stretch>
@@ -882,7 +890,7 @@
                     </pic:cNvPicPr>
                   </pic:nvPicPr>
                   <pic:blipFill>
-                    <a:blip r:link="rId8"/>
+                    <a:blip r:link="rId9"/>
                     <a:stretch>
                       <a:fillRect/>
                     </a:stretch>
@@ -936,11 +944,11 @@
         </w:numPr>
         <w:tabs>
           <w:tab w:val="clear" w:pos="1134"/>
-          <w:tab w:val="left" w:pos="754" w:leader="none"/>
-        </w:tabs>
-        <w:bidi w:val="0"/>
-        <w:spacing w:before="45" w:after="0"/>
-        <w:ind w:hanging="283" w:left="754"/>
+          <w:tab w:val="left" w:pos="769" w:leader="none"/>
+        </w:tabs>
+        <w:bidi w:val="0"/>
+        <w:spacing w:before="60" w:after="0"/>
+        <w:ind w:hanging="283" w:left="769"/>
         <w:jc w:val="left"/>
         <w:rPr/>
       </w:pPr>
@@ -964,11 +972,11 @@
         </w:numPr>
         <w:tabs>
           <w:tab w:val="clear" w:pos="1134"/>
-          <w:tab w:val="left" w:pos="754" w:leader="none"/>
-        </w:tabs>
-        <w:bidi w:val="0"/>
-        <w:spacing w:before="45" w:after="0"/>
-        <w:ind w:hanging="283" w:left="754"/>
+          <w:tab w:val="left" w:pos="769" w:leader="none"/>
+        </w:tabs>
+        <w:bidi w:val="0"/>
+        <w:spacing w:before="60" w:after="0"/>
+        <w:ind w:hanging="283" w:left="769"/>
         <w:jc w:val="left"/>
         <w:rPr/>
       </w:pPr>
@@ -992,11 +1000,11 @@
         </w:numPr>
         <w:tabs>
           <w:tab w:val="clear" w:pos="1134"/>
-          <w:tab w:val="left" w:pos="754" w:leader="none"/>
-        </w:tabs>
-        <w:bidi w:val="0"/>
-        <w:spacing w:before="45" w:after="0"/>
-        <w:ind w:hanging="283" w:left="754"/>
+          <w:tab w:val="left" w:pos="769" w:leader="none"/>
+        </w:tabs>
+        <w:bidi w:val="0"/>
+        <w:spacing w:before="60" w:after="0"/>
+        <w:ind w:hanging="283" w:left="769"/>
         <w:jc w:val="left"/>
         <w:rPr/>
       </w:pPr>
@@ -1020,23 +1028,35 @@
         </w:numPr>
         <w:tabs>
           <w:tab w:val="clear" w:pos="1134"/>
-          <w:tab w:val="left" w:pos="754" w:leader="none"/>
-        </w:tabs>
-        <w:bidi w:val="0"/>
-        <w:spacing w:before="45" w:after="0"/>
-        <w:ind w:hanging="283" w:left="754"/>
-        <w:jc w:val="left"/>
-        <w:rPr/>
-      </w:pPr>
-      <w:r>
-        <w:rPr>
-          <w:rStyle w:val="Strong"/>
-        </w:rPr>
-        <w:t>Digital transformation:</w:t>
-      </w:r>
-      <w:r>
-        <w:rPr/>
-        <w:t xml:space="preserve"> Python/API-driven automation and digital twins for OrcaFlex, AQWA, OrcaWave, ANSYS, COMSOL, BSEE field economics, drilling analytics, production surveillance, and fitness-for-service. </w:t>
+          <w:tab w:val="left" w:pos="769" w:leader="none"/>
+        </w:tabs>
+        <w:bidi w:val="0"/>
+        <w:spacing w:before="60" w:after="0"/>
+        <w:ind w:hanging="283" w:left="769"/>
+        <w:jc w:val="left"/>
+        <w:rPr/>
+      </w:pPr>
+      <w:r>
+        <w:rPr>
+          <w:rStyle w:val="Strong"/>
+        </w:rPr>
+        <w:t>Engineering-workflows platform (Deckhand):</w:t>
+      </w:r>
+      <w:r>
+        <w:rPr/>
+        <w:t xml:space="preserve"> API-first platform with ~30 deterministic, standards-based screening workflows (fatigue, seakeeping, lifting, weather windows) and provenance-gated licensed OrcaFlex/AQWA runs — </w:t>
+      </w:r>
+      <w:hyperlink r:id="rId10">
+        <w:r>
+          <w:rPr>
+            <w:rStyle w:val="Hyperlink"/>
+          </w:rPr>
+          <w:t>live demo gallery</w:t>
+        </w:r>
+      </w:hyperlink>
+      <w:r>
+        <w:rPr/>
+        <w:t xml:space="preserve">. </w:t>
       </w:r>
     </w:p>
     <w:p>
@@ -1048,25 +1068,24 @@
         </w:numPr>
         <w:tabs>
           <w:tab w:val="clear" w:pos="1134"/>
-          <w:tab w:val="left" w:pos="754" w:leader="none"/>
-        </w:tabs>
-        <w:bidi w:val="0"/>
-        <w:spacing w:before="45" w:after="0"/>
-        <w:ind w:hanging="283" w:left="754"/>
-        <w:jc w:val="left"/>
-        <w:rPr/>
-      </w:pPr>
-      <w:r>
-        <w:rPr>
-          <w:rStyle w:val="Strong"/>
-        </w:rPr>
-        <w:t>Open, demonstrable engineering &amp; AI:</w:t>
+          <w:tab w:val="left" w:pos="769" w:leader="none"/>
+        </w:tabs>
+        <w:bidi w:val="0"/>
+        <w:ind w:hanging="283" w:left="769"/>
+        <w:jc w:val="left"/>
+        <w:rPr/>
+      </w:pPr>
+      <w:r>
+        <w:rPr>
+          <w:rStyle w:val="Strong"/>
+        </w:rPr>
+        <w:t>Open, demonstrable engineering:</w:t>
       </w:r>
       <w:r>
         <w:rPr/>
         <w:t xml:space="preserve"> Live public tools — </w:t>
       </w:r>
-      <w:hyperlink r:id="rId9">
+      <w:hyperlink r:id="rId11">
         <w:r>
           <w:rPr>
             <w:rStyle w:val="Hyperlink"/>
@@ -1076,34 +1095,7 @@
       </w:hyperlink>
       <w:r>
         <w:rPr/>
-        <w:t xml:space="preserve"> (GoM field economics &amp; well analytics on BSEE data) and digitalmodel (open offshore engineering library) — deterministic, unit-tested, provenance-traced. </w:t>
-      </w:r>
-    </w:p>
-    <w:p>
-      <w:pPr>
-        <w:pStyle w:val="BodyText"/>
-        <w:numPr>
-          <w:ilvl w:val="0"/>
-          <w:numId w:val="1"/>
-        </w:numPr>
-        <w:tabs>
-          <w:tab w:val="clear" w:pos="1134"/>
-          <w:tab w:val="left" w:pos="754" w:leader="none"/>
-        </w:tabs>
-        <w:bidi w:val="0"/>
-        <w:ind w:hanging="283" w:left="754"/>
-        <w:jc w:val="left"/>
-        <w:rPr/>
-      </w:pPr>
-      <w:r>
-        <w:rPr>
-          <w:rStyle w:val="Strong"/>
-        </w:rPr>
-        <w:t>Standards and technical credibility:</w:t>
-      </w:r>
-      <w:r>
-        <w:rPr/>
-        <w:t xml:space="preserve"> API committee participant/contributor for API-RP-16Q, API-RP-17G, and API-RP-17G2; author/co-author for OTC, OMAE, IADC, and World Oil. </w:t>
+        <w:t xml:space="preserve"> (GoM field economics on BSEE data) and digitalmodel (open offshore library) — deterministic, unit-tested, provenance-traced; OTC/OMAE/IADC/World Oil author. </w:t>
       </w:r>
     </w:p>
     <w:p>
@@ -1204,7 +1196,7 @@
       </w:r>
       <w:r>
         <w:rPr/>
-        <w:t xml:space="preserve"> Naval architecture, floating systems, FST/FPSO/FPU concepts, LNG marine operations, risers (SCR, TTR, hybrid, lazy-wave, simple catenary), pipelines, umbilicals, jumpers, manifolds, moorings, CALM/SALM buoys, installation engineering, integrity management, decommissioning.</w:t>
+        <w:t xml:space="preserve"> Naval architecture, floating systems, FST/FPSO/FPU concepts, floating offshore wind platform sizing, LNG marine operations, risers (SCR, TTR, hybrid, lazy-wave, simple catenary), pipelines, umbilicals, jumpers, manifolds, moorings, CALM/SALM buoys, installation engineering, integrity management, decommissioning.</w:t>
       </w:r>
     </w:p>
     <w:p>
@@ -1222,7 +1214,25 @@
       </w:r>
       <w:r>
         <w:rPr/>
-        <w:t xml:space="preserve"> Coupled dynamic analysis, diffraction/radiation analysis, mooring analysis, time-domain simulations, global riser analysis, pipelay and installation windows, detailed FEA, nonlinear elastic-plastic analysis, fracture mechanics, fatigue, corrosion simulation, hydrodynamics, operability assessment.</w:t>
+        <w:t xml:space="preserve"> Coupled dynamic analysis, diffraction/radiation analysis, mooring analysis, time-domain simulations, global riser analysis, pipelay and installation windows, detailed FEA, nonlinear elastic-plastic analysis, fracture mechanics, fatigue, corrosion simulation, hydrodynamics, operability assessment (DNV-RP-H103 / DNVGL-ST-N001 weather windows and operation envelopes).</w:t>
+      </w:r>
+    </w:p>
+    <w:p>
+      <w:pPr>
+        <w:pStyle w:val="BodyText"/>
+        <w:bidi w:val="0"/>
+        <w:jc w:val="left"/>
+        <w:rPr/>
+      </w:pPr>
+      <w:r>
+        <w:rPr>
+          <w:rStyle w:val="Strong"/>
+        </w:rPr>
+        <w:t>CFD:</w:t>
+      </w:r>
+      <w:r>
+        <w:rPr/>
+        <w:t xml:space="preserve"> OpenFOAM (RANS k-ω SST, laminar, free-surface VOF/olaFlow waves) on a license-free FreeCAD/gmsh → OpenFOAM → PyVista pipeline, validated against canonical benchmarks — Blasius flat plate, cylinder Re=100 vortex shedding, NACA0012 airfoil, dam-break free surface — with published live validation reports.</w:t>
       </w:r>
     </w:p>
     <w:p>
@@ -1337,11 +1347,11 @@
         </w:numPr>
         <w:tabs>
           <w:tab w:val="clear" w:pos="1134"/>
-          <w:tab w:val="left" w:pos="754" w:leader="none"/>
-        </w:tabs>
-        <w:bidi w:val="0"/>
-        <w:spacing w:before="45" w:after="0"/>
-        <w:ind w:hanging="283" w:left="754"/>
+          <w:tab w:val="left" w:pos="769" w:leader="none"/>
+        </w:tabs>
+        <w:bidi w:val="0"/>
+        <w:spacing w:before="60" w:after="0"/>
+        <w:ind w:hanging="283" w:left="769"/>
         <w:jc w:val="left"/>
         <w:rPr/>
       </w:pPr>
@@ -1365,11 +1375,11 @@
         </w:numPr>
         <w:tabs>
           <w:tab w:val="clear" w:pos="1134"/>
-          <w:tab w:val="left" w:pos="754" w:leader="none"/>
-        </w:tabs>
-        <w:bidi w:val="0"/>
-        <w:spacing w:before="45" w:after="0"/>
-        <w:ind w:hanging="283" w:left="754"/>
+          <w:tab w:val="left" w:pos="769" w:leader="none"/>
+        </w:tabs>
+        <w:bidi w:val="0"/>
+        <w:spacing w:before="60" w:after="0"/>
+        <w:ind w:hanging="283" w:left="769"/>
         <w:jc w:val="left"/>
         <w:rPr/>
       </w:pPr>
@@ -1393,11 +1403,11 @@
         </w:numPr>
         <w:tabs>
           <w:tab w:val="clear" w:pos="1134"/>
-          <w:tab w:val="left" w:pos="754" w:leader="none"/>
-        </w:tabs>
-        <w:bidi w:val="0"/>
-        <w:spacing w:before="45" w:after="0"/>
-        <w:ind w:hanging="283" w:left="754"/>
+          <w:tab w:val="left" w:pos="769" w:leader="none"/>
+        </w:tabs>
+        <w:bidi w:val="0"/>
+        <w:spacing w:before="60" w:after="0"/>
+        <w:ind w:hanging="283" w:left="769"/>
         <w:jc w:val="left"/>
         <w:rPr/>
       </w:pPr>
@@ -1421,10 +1431,10 @@
         </w:numPr>
         <w:tabs>
           <w:tab w:val="clear" w:pos="1134"/>
-          <w:tab w:val="left" w:pos="754" w:leader="none"/>
-        </w:tabs>
-        <w:bidi w:val="0"/>
-        <w:ind w:hanging="283" w:left="754"/>
+          <w:tab w:val="left" w:pos="769" w:leader="none"/>
+        </w:tabs>
+        <w:bidi w:val="0"/>
+        <w:ind w:hanging="283" w:left="769"/>
         <w:jc w:val="left"/>
         <w:rPr/>
       </w:pPr>
@@ -1474,11 +1484,11 @@
         </w:numPr>
         <w:tabs>
           <w:tab w:val="clear" w:pos="1134"/>
-          <w:tab w:val="left" w:pos="754" w:leader="none"/>
-        </w:tabs>
-        <w:bidi w:val="0"/>
-        <w:spacing w:before="45" w:after="0"/>
-        <w:ind w:hanging="283" w:left="754"/>
+          <w:tab w:val="left" w:pos="769" w:leader="none"/>
+        </w:tabs>
+        <w:bidi w:val="0"/>
+        <w:spacing w:before="60" w:after="0"/>
+        <w:ind w:hanging="283" w:left="769"/>
         <w:jc w:val="left"/>
         <w:rPr/>
       </w:pPr>
@@ -1496,11 +1506,11 @@
         </w:numPr>
         <w:tabs>
           <w:tab w:val="clear" w:pos="1134"/>
-          <w:tab w:val="left" w:pos="754" w:leader="none"/>
-        </w:tabs>
-        <w:bidi w:val="0"/>
-        <w:spacing w:before="45" w:after="0"/>
-        <w:ind w:hanging="283" w:left="754"/>
+          <w:tab w:val="left" w:pos="769" w:leader="none"/>
+        </w:tabs>
+        <w:bidi w:val="0"/>
+        <w:spacing w:before="60" w:after="0"/>
+        <w:ind w:hanging="283" w:left="769"/>
         <w:jc w:val="left"/>
         <w:rPr/>
       </w:pPr>
@@ -1524,11 +1534,11 @@
         </w:numPr>
         <w:tabs>
           <w:tab w:val="clear" w:pos="1134"/>
-          <w:tab w:val="left" w:pos="754" w:leader="none"/>
-        </w:tabs>
-        <w:bidi w:val="0"/>
-        <w:spacing w:before="45" w:after="0"/>
-        <w:ind w:hanging="283" w:left="754"/>
+          <w:tab w:val="left" w:pos="769" w:leader="none"/>
+        </w:tabs>
+        <w:bidi w:val="0"/>
+        <w:spacing w:before="60" w:after="0"/>
+        <w:ind w:hanging="283" w:left="769"/>
         <w:jc w:val="left"/>
         <w:rPr/>
       </w:pPr>
@@ -1552,11 +1562,11 @@
         </w:numPr>
         <w:tabs>
           <w:tab w:val="clear" w:pos="1134"/>
-          <w:tab w:val="left" w:pos="754" w:leader="none"/>
-        </w:tabs>
-        <w:bidi w:val="0"/>
-        <w:spacing w:before="45" w:after="0"/>
-        <w:ind w:hanging="283" w:left="754"/>
+          <w:tab w:val="left" w:pos="769" w:leader="none"/>
+        </w:tabs>
+        <w:bidi w:val="0"/>
+        <w:spacing w:before="60" w:after="0"/>
+        <w:ind w:hanging="283" w:left="769"/>
         <w:jc w:val="left"/>
         <w:rPr/>
       </w:pPr>
@@ -1580,10 +1590,10 @@
         </w:numPr>
         <w:tabs>
           <w:tab w:val="clear" w:pos="1134"/>
-          <w:tab w:val="left" w:pos="754" w:leader="none"/>
-        </w:tabs>
-        <w:bidi w:val="0"/>
-        <w:ind w:hanging="283" w:left="754"/>
+          <w:tab w:val="left" w:pos="769" w:leader="none"/>
+        </w:tabs>
+        <w:bidi w:val="0"/>
+        <w:ind w:hanging="283" w:left="769"/>
         <w:jc w:val="left"/>
         <w:rPr/>
       </w:pPr>
@@ -1627,11 +1637,11 @@
         </w:numPr>
         <w:tabs>
           <w:tab w:val="clear" w:pos="1134"/>
-          <w:tab w:val="left" w:pos="754" w:leader="none"/>
-        </w:tabs>
-        <w:bidi w:val="0"/>
-        <w:spacing w:before="45" w:after="0"/>
-        <w:ind w:hanging="283" w:left="754"/>
+          <w:tab w:val="left" w:pos="769" w:leader="none"/>
+        </w:tabs>
+        <w:bidi w:val="0"/>
+        <w:spacing w:before="60" w:after="0"/>
+        <w:ind w:hanging="283" w:left="769"/>
         <w:jc w:val="left"/>
         <w:rPr/>
       </w:pPr>
@@ -1649,11 +1659,11 @@
         </w:numPr>
         <w:tabs>
           <w:tab w:val="clear" w:pos="1134"/>
-          <w:tab w:val="left" w:pos="754" w:leader="none"/>
-        </w:tabs>
-        <w:bidi w:val="0"/>
-        <w:spacing w:before="45" w:after="0"/>
-        <w:ind w:hanging="283" w:left="754"/>
+          <w:tab w:val="left" w:pos="769" w:leader="none"/>
+        </w:tabs>
+        <w:bidi w:val="0"/>
+        <w:spacing w:before="60" w:after="0"/>
+        <w:ind w:hanging="283" w:left="769"/>
         <w:jc w:val="left"/>
         <w:rPr/>
       </w:pPr>
@@ -1677,11 +1687,11 @@
         </w:numPr>
         <w:tabs>
           <w:tab w:val="clear" w:pos="1134"/>
-          <w:tab w:val="left" w:pos="754" w:leader="none"/>
-        </w:tabs>
-        <w:bidi w:val="0"/>
-        <w:spacing w:before="45" w:after="0"/>
-        <w:ind w:hanging="283" w:left="754"/>
+          <w:tab w:val="left" w:pos="769" w:leader="none"/>
+        </w:tabs>
+        <w:bidi w:val="0"/>
+        <w:spacing w:before="60" w:after="0"/>
+        <w:ind w:hanging="283" w:left="769"/>
         <w:jc w:val="left"/>
         <w:rPr/>
       </w:pPr>
@@ -1705,11 +1715,11 @@
         </w:numPr>
         <w:tabs>
           <w:tab w:val="clear" w:pos="1134"/>
-          <w:tab w:val="left" w:pos="754" w:leader="none"/>
-        </w:tabs>
-        <w:bidi w:val="0"/>
-        <w:spacing w:before="45" w:after="0"/>
-        <w:ind w:hanging="283" w:left="754"/>
+          <w:tab w:val="left" w:pos="769" w:leader="none"/>
+        </w:tabs>
+        <w:bidi w:val="0"/>
+        <w:spacing w:before="60" w:after="0"/>
+        <w:ind w:hanging="283" w:left="769"/>
         <w:jc w:val="left"/>
         <w:rPr/>
       </w:pPr>
@@ -1733,11 +1743,11 @@
         </w:numPr>
         <w:tabs>
           <w:tab w:val="clear" w:pos="1134"/>
-          <w:tab w:val="left" w:pos="754" w:leader="none"/>
-        </w:tabs>
-        <w:bidi w:val="0"/>
-        <w:spacing w:before="45" w:after="0"/>
-        <w:ind w:hanging="283" w:left="754"/>
+          <w:tab w:val="left" w:pos="769" w:leader="none"/>
+        </w:tabs>
+        <w:bidi w:val="0"/>
+        <w:spacing w:before="60" w:after="0"/>
+        <w:ind w:hanging="283" w:left="769"/>
         <w:jc w:val="left"/>
         <w:rPr/>
       </w:pPr>
@@ -1761,11 +1771,11 @@
         </w:numPr>
         <w:tabs>
           <w:tab w:val="clear" w:pos="1134"/>
-          <w:tab w:val="left" w:pos="754" w:leader="none"/>
-        </w:tabs>
-        <w:bidi w:val="0"/>
-        <w:spacing w:before="45" w:after="0"/>
-        <w:ind w:hanging="283" w:left="754"/>
+          <w:tab w:val="left" w:pos="769" w:leader="none"/>
+        </w:tabs>
+        <w:bidi w:val="0"/>
+        <w:spacing w:before="60" w:after="0"/>
+        <w:ind w:hanging="283" w:left="769"/>
         <w:jc w:val="left"/>
         <w:rPr/>
       </w:pPr>
@@ -1789,11 +1799,11 @@
         </w:numPr>
         <w:tabs>
           <w:tab w:val="clear" w:pos="1134"/>
-          <w:tab w:val="left" w:pos="754" w:leader="none"/>
-        </w:tabs>
-        <w:bidi w:val="0"/>
-        <w:spacing w:before="45" w:after="0"/>
-        <w:ind w:hanging="283" w:left="754"/>
+          <w:tab w:val="left" w:pos="769" w:leader="none"/>
+        </w:tabs>
+        <w:bidi w:val="0"/>
+        <w:spacing w:before="60" w:after="0"/>
+        <w:ind w:hanging="283" w:left="769"/>
         <w:jc w:val="left"/>
         <w:rPr/>
       </w:pPr>
@@ -1817,11 +1827,11 @@
         </w:numPr>
         <w:tabs>
           <w:tab w:val="clear" w:pos="1134"/>
-          <w:tab w:val="left" w:pos="754" w:leader="none"/>
-        </w:tabs>
-        <w:bidi w:val="0"/>
-        <w:spacing w:before="45" w:after="0"/>
-        <w:ind w:hanging="283" w:left="754"/>
+          <w:tab w:val="left" w:pos="769" w:leader="none"/>
+        </w:tabs>
+        <w:bidi w:val="0"/>
+        <w:spacing w:before="60" w:after="0"/>
+        <w:ind w:hanging="283" w:left="769"/>
         <w:jc w:val="left"/>
         <w:rPr/>
       </w:pPr>
@@ -1845,11 +1855,11 @@
         </w:numPr>
         <w:tabs>
           <w:tab w:val="clear" w:pos="1134"/>
-          <w:tab w:val="left" w:pos="754" w:leader="none"/>
-        </w:tabs>
-        <w:bidi w:val="0"/>
-        <w:spacing w:before="45" w:after="0"/>
-        <w:ind w:hanging="283" w:left="754"/>
+          <w:tab w:val="left" w:pos="769" w:leader="none"/>
+        </w:tabs>
+        <w:bidi w:val="0"/>
+        <w:spacing w:before="60" w:after="0"/>
+        <w:ind w:hanging="283" w:left="769"/>
         <w:jc w:val="left"/>
         <w:rPr/>
       </w:pPr>
@@ -1873,11 +1883,11 @@
         </w:numPr>
         <w:tabs>
           <w:tab w:val="clear" w:pos="1134"/>
-          <w:tab w:val="left" w:pos="754" w:leader="none"/>
-        </w:tabs>
-        <w:bidi w:val="0"/>
-        <w:spacing w:before="45" w:after="0"/>
-        <w:ind w:hanging="283" w:left="754"/>
+          <w:tab w:val="left" w:pos="769" w:leader="none"/>
+        </w:tabs>
+        <w:bidi w:val="0"/>
+        <w:spacing w:before="60" w:after="0"/>
+        <w:ind w:hanging="283" w:left="769"/>
         <w:jc w:val="left"/>
         <w:rPr/>
       </w:pPr>
@@ -1901,11 +1911,11 @@
         </w:numPr>
         <w:tabs>
           <w:tab w:val="clear" w:pos="1134"/>
-          <w:tab w:val="left" w:pos="754" w:leader="none"/>
-        </w:tabs>
-        <w:bidi w:val="0"/>
-        <w:spacing w:before="45" w:after="0"/>
-        <w:ind w:hanging="283" w:left="754"/>
+          <w:tab w:val="left" w:pos="769" w:leader="none"/>
+        </w:tabs>
+        <w:bidi w:val="0"/>
+        <w:spacing w:before="60" w:after="0"/>
+        <w:ind w:hanging="283" w:left="769"/>
         <w:jc w:val="left"/>
         <w:rPr/>
       </w:pPr>
@@ -1929,10 +1939,51 @@
         </w:numPr>
         <w:tabs>
           <w:tab w:val="clear" w:pos="1134"/>
-          <w:tab w:val="left" w:pos="754" w:leader="none"/>
-        </w:tabs>
-        <w:bidi w:val="0"/>
-        <w:ind w:hanging="283" w:left="754"/>
+          <w:tab w:val="left" w:pos="769" w:leader="none"/>
+        </w:tabs>
+        <w:bidi w:val="0"/>
+        <w:spacing w:before="60" w:after="0"/>
+        <w:ind w:hanging="283" w:left="769"/>
+        <w:jc w:val="left"/>
+        <w:rPr/>
+      </w:pPr>
+      <w:r>
+        <w:rPr>
+          <w:rStyle w:val="Strong"/>
+        </w:rPr>
+        <w:t>Deckhand engineering-workflows API:</w:t>
+      </w:r>
+      <w:r>
+        <w:rPr/>
+        <w:t xml:space="preserve"> Designed and built an API-first platform (request in → deterministic analysis → report URL out) with a catalog of ~30 standards-based screening workflows — mooring/riser fatigue, spectral fatigue from RAOs, vessel seakeeping, mudmat bearing, lifting lugs, weather windows, liquefaction — versioned algorithm routing, provenance-gated licensed OrcaFlex/AQWA execution on an automated Windows lane, and chat-bot delivery; public </w:t>
+      </w:r>
+      <w:hyperlink r:id="rId12">
+        <w:r>
+          <w:rPr>
+            <w:rStyle w:val="Hyperlink"/>
+          </w:rPr>
+          <w:t>demo gallery</w:t>
+        </w:r>
+      </w:hyperlink>
+      <w:r>
+        <w:rPr/>
+        <w:t xml:space="preserve">. </w:t>
+      </w:r>
+    </w:p>
+    <w:p>
+      <w:pPr>
+        <w:pStyle w:val="BodyText"/>
+        <w:numPr>
+          <w:ilvl w:val="0"/>
+          <w:numId w:val="4"/>
+        </w:numPr>
+        <w:tabs>
+          <w:tab w:val="clear" w:pos="1134"/>
+          <w:tab w:val="left" w:pos="769" w:leader="none"/>
+        </w:tabs>
+        <w:bidi w:val="0"/>
+        <w:spacing w:before="60" w:after="0"/>
+        <w:ind w:hanging="283" w:left="769"/>
         <w:jc w:val="left"/>
         <w:rPr/>
       </w:pPr>
@@ -1946,7 +1997,7 @@
         <w:rPr/>
         <w:t xml:space="preserve"> Built and shipped public, deterministic engineering sites and libraries — </w:t>
       </w:r>
-      <w:hyperlink r:id="rId10">
+      <w:hyperlink r:id="rId13">
         <w:r>
           <w:rPr>
             <w:rStyle w:val="Hyperlink"/>
@@ -1956,7 +2007,74 @@
       </w:hyperlink>
       <w:r>
         <w:rPr/>
-        <w:t xml:space="preserve"> (live GoM field economics &amp; well analytics on BSEE data: Lower-Tertiary NPVs, 56-well benchmarking, 3D well paths), digitalmodel (open offshore engineering library), and a Raw-to-Knowledge playbook — every result unit-tested and provenance-traced, delivered as zero-server static HTML, with AI/LLM as narrative support over deterministic cores. </w:t>
+        <w:t xml:space="preserve"> (live GoM field economics &amp; well analytics on BSEE data: Lower-Tertiary NPVs, 56-well benchmarking, 3D well paths), </w:t>
+      </w:r>
+      <w:hyperlink r:id="rId14">
+        <w:r>
+          <w:rPr>
+            <w:rStyle w:val="Hyperlink"/>
+          </w:rPr>
+          <w:t>digitalmodel</w:t>
+        </w:r>
+      </w:hyperlink>
+      <w:r>
+        <w:rPr/>
+        <w:t xml:space="preserve"> (open offshore engineering library: 221 S-N fatigue curves across 17 standards, OrcaWave/AQWA diffraction benchmarks, vessel/rig database of 2,268 rigs + 165 construction vessels with installation-suitability API, floating-wind platform sizing, rudder/manoeuvring and rod-pump dynacard explorers, validated OpenFOAM CFD suite), and a Raw-to-Knowledge playbook — every result unit-tested and provenance-traced, delivered as zero-server static HTML, with AI/LLM as narrative support over deterministic cores. </w:t>
+      </w:r>
+    </w:p>
+    <w:p>
+      <w:pPr>
+        <w:pStyle w:val="BodyText"/>
+        <w:numPr>
+          <w:ilvl w:val="0"/>
+          <w:numId w:val="4"/>
+        </w:numPr>
+        <w:tabs>
+          <w:tab w:val="clear" w:pos="1134"/>
+          <w:tab w:val="left" w:pos="769" w:leader="none"/>
+        </w:tabs>
+        <w:bidi w:val="0"/>
+        <w:spacing w:before="60" w:after="0"/>
+        <w:ind w:hanging="283" w:left="769"/>
+        <w:jc w:val="left"/>
+        <w:rPr/>
+      </w:pPr>
+      <w:r>
+        <w:rPr>
+          <w:rStyle w:val="Strong"/>
+        </w:rPr>
+        <w:t>AI-augmented engineering operations:</w:t>
+      </w:r>
+      <w:r>
+        <w:rPr/>
+        <w:t xml:space="preserve"> Operate a 25+ repository engineering ecosystem with agentic LLM workflows under CI-enforced invariants, including an LLM-assisted solver model-generation pipeline (project data → specification YAML + assumption ledger → licensed OrcaWave/AQWA/OrcaFlex input) where every published number is provenance-gated — LLM proposes, deterministic code disposes. </w:t>
+      </w:r>
+    </w:p>
+    <w:p>
+      <w:pPr>
+        <w:pStyle w:val="BodyText"/>
+        <w:numPr>
+          <w:ilvl w:val="0"/>
+          <w:numId w:val="4"/>
+        </w:numPr>
+        <w:tabs>
+          <w:tab w:val="clear" w:pos="1134"/>
+          <w:tab w:val="left" w:pos="769" w:leader="none"/>
+        </w:tabs>
+        <w:bidi w:val="0"/>
+        <w:ind w:hanging="283" w:left="769"/>
+        <w:jc w:val="left"/>
+        <w:rPr/>
+      </w:pPr>
+      <w:r>
+        <w:rPr>
+          <w:rStyle w:val="Strong"/>
+        </w:rPr>
+        <w:t>Marine safety / HSE analytics:</w:t>
+      </w:r>
+      <w:r>
+        <w:rPr/>
+        <w:t xml:space="preserve"> Built BSEE incident-database analytics (1,987 GoM incidents across failure modes) powering incident-grounded failure-mode reports and seasonal-preparedness studies for offshore operations. </w:t>
       </w:r>
     </w:p>
     <w:p>
@@ -1994,11 +2112,11 @@
         </w:numPr>
         <w:tabs>
           <w:tab w:val="clear" w:pos="1134"/>
-          <w:tab w:val="left" w:pos="754" w:leader="none"/>
-        </w:tabs>
-        <w:bidi w:val="0"/>
-        <w:spacing w:before="45" w:after="0"/>
-        <w:ind w:hanging="283" w:left="754"/>
+          <w:tab w:val="left" w:pos="769" w:leader="none"/>
+        </w:tabs>
+        <w:bidi w:val="0"/>
+        <w:spacing w:before="60" w:after="0"/>
+        <w:ind w:hanging="283" w:left="769"/>
         <w:jc w:val="left"/>
         <w:rPr/>
       </w:pPr>
@@ -2016,11 +2134,11 @@
         </w:numPr>
         <w:tabs>
           <w:tab w:val="clear" w:pos="1134"/>
-          <w:tab w:val="left" w:pos="754" w:leader="none"/>
-        </w:tabs>
-        <w:bidi w:val="0"/>
-        <w:spacing w:before="45" w:after="0"/>
-        <w:ind w:hanging="283" w:left="754"/>
+          <w:tab w:val="left" w:pos="769" w:leader="none"/>
+        </w:tabs>
+        <w:bidi w:val="0"/>
+        <w:spacing w:before="60" w:after="0"/>
+        <w:ind w:hanging="283" w:left="769"/>
         <w:jc w:val="left"/>
         <w:rPr/>
       </w:pPr>
@@ -2044,11 +2162,11 @@
         </w:numPr>
         <w:tabs>
           <w:tab w:val="clear" w:pos="1134"/>
-          <w:tab w:val="left" w:pos="754" w:leader="none"/>
-        </w:tabs>
-        <w:bidi w:val="0"/>
-        <w:spacing w:before="45" w:after="0"/>
-        <w:ind w:hanging="283" w:left="754"/>
+          <w:tab w:val="left" w:pos="769" w:leader="none"/>
+        </w:tabs>
+        <w:bidi w:val="0"/>
+        <w:spacing w:before="60" w:after="0"/>
+        <w:ind w:hanging="283" w:left="769"/>
         <w:jc w:val="left"/>
         <w:rPr/>
       </w:pPr>
@@ -2072,11 +2190,11 @@
         </w:numPr>
         <w:tabs>
           <w:tab w:val="clear" w:pos="1134"/>
-          <w:tab w:val="left" w:pos="754" w:leader="none"/>
-        </w:tabs>
-        <w:bidi w:val="0"/>
-        <w:spacing w:before="45" w:after="0"/>
-        <w:ind w:hanging="283" w:left="754"/>
+          <w:tab w:val="left" w:pos="769" w:leader="none"/>
+        </w:tabs>
+        <w:bidi w:val="0"/>
+        <w:spacing w:before="60" w:after="0"/>
+        <w:ind w:hanging="283" w:left="769"/>
         <w:jc w:val="left"/>
         <w:rPr/>
       </w:pPr>
@@ -2100,10 +2218,10 @@
         </w:numPr>
         <w:tabs>
           <w:tab w:val="clear" w:pos="1134"/>
-          <w:tab w:val="left" w:pos="754" w:leader="none"/>
-        </w:tabs>
-        <w:bidi w:val="0"/>
-        <w:ind w:hanging="283" w:left="754"/>
+          <w:tab w:val="left" w:pos="769" w:leader="none"/>
+        </w:tabs>
+        <w:bidi w:val="0"/>
+        <w:ind w:hanging="283" w:left="769"/>
         <w:jc w:val="left"/>
         <w:rPr/>
       </w:pPr>
@@ -2147,11 +2265,11 @@
         </w:numPr>
         <w:tabs>
           <w:tab w:val="clear" w:pos="1134"/>
-          <w:tab w:val="left" w:pos="754" w:leader="none"/>
-        </w:tabs>
-        <w:bidi w:val="0"/>
-        <w:spacing w:before="45" w:after="0"/>
-        <w:ind w:hanging="283" w:left="754"/>
+          <w:tab w:val="left" w:pos="769" w:leader="none"/>
+        </w:tabs>
+        <w:bidi w:val="0"/>
+        <w:spacing w:before="60" w:after="0"/>
+        <w:ind w:hanging="283" w:left="769"/>
         <w:jc w:val="left"/>
         <w:rPr/>
       </w:pPr>
@@ -2169,11 +2287,11 @@
         </w:numPr>
         <w:tabs>
           <w:tab w:val="clear" w:pos="1134"/>
-          <w:tab w:val="left" w:pos="754" w:leader="none"/>
-        </w:tabs>
-        <w:bidi w:val="0"/>
-        <w:spacing w:before="45" w:after="0"/>
-        <w:ind w:hanging="283" w:left="754"/>
+          <w:tab w:val="left" w:pos="769" w:leader="none"/>
+        </w:tabs>
+        <w:bidi w:val="0"/>
+        <w:spacing w:before="60" w:after="0"/>
+        <w:ind w:hanging="283" w:left="769"/>
         <w:jc w:val="left"/>
         <w:rPr/>
       </w:pPr>
@@ -2197,11 +2315,11 @@
         </w:numPr>
         <w:tabs>
           <w:tab w:val="clear" w:pos="1134"/>
-          <w:tab w:val="left" w:pos="754" w:leader="none"/>
-        </w:tabs>
-        <w:bidi w:val="0"/>
-        <w:spacing w:before="45" w:after="0"/>
-        <w:ind w:hanging="283" w:left="754"/>
+          <w:tab w:val="left" w:pos="769" w:leader="none"/>
+        </w:tabs>
+        <w:bidi w:val="0"/>
+        <w:spacing w:before="60" w:after="0"/>
+        <w:ind w:hanging="283" w:left="769"/>
         <w:jc w:val="left"/>
         <w:rPr/>
       </w:pPr>
@@ -2225,11 +2343,11 @@
         </w:numPr>
         <w:tabs>
           <w:tab w:val="clear" w:pos="1134"/>
-          <w:tab w:val="left" w:pos="754" w:leader="none"/>
-        </w:tabs>
-        <w:bidi w:val="0"/>
-        <w:spacing w:before="45" w:after="0"/>
-        <w:ind w:hanging="283" w:left="754"/>
+          <w:tab w:val="left" w:pos="769" w:leader="none"/>
+        </w:tabs>
+        <w:bidi w:val="0"/>
+        <w:spacing w:before="60" w:after="0"/>
+        <w:ind w:hanging="283" w:left="769"/>
         <w:jc w:val="left"/>
         <w:rPr/>
       </w:pPr>
@@ -2253,11 +2371,11 @@
         </w:numPr>
         <w:tabs>
           <w:tab w:val="clear" w:pos="1134"/>
-          <w:tab w:val="left" w:pos="754" w:leader="none"/>
-        </w:tabs>
-        <w:bidi w:val="0"/>
-        <w:spacing w:before="45" w:after="0"/>
-        <w:ind w:hanging="283" w:left="754"/>
+          <w:tab w:val="left" w:pos="769" w:leader="none"/>
+        </w:tabs>
+        <w:bidi w:val="0"/>
+        <w:spacing w:before="60" w:after="0"/>
+        <w:ind w:hanging="283" w:left="769"/>
         <w:jc w:val="left"/>
         <w:rPr/>
       </w:pPr>
@@ -2281,10 +2399,10 @@
         </w:numPr>
         <w:tabs>
           <w:tab w:val="clear" w:pos="1134"/>
-          <w:tab w:val="left" w:pos="754" w:leader="none"/>
-        </w:tabs>
-        <w:bidi w:val="0"/>
-        <w:ind w:hanging="283" w:left="754"/>
+          <w:tab w:val="left" w:pos="769" w:leader="none"/>
+        </w:tabs>
+        <w:bidi w:val="0"/>
+        <w:ind w:hanging="283" w:left="769"/>
         <w:jc w:val="left"/>
         <w:rPr/>
       </w:pPr>
@@ -2325,11 +2443,11 @@
         </w:numPr>
         <w:tabs>
           <w:tab w:val="clear" w:pos="1134"/>
-          <w:tab w:val="left" w:pos="754" w:leader="none"/>
-        </w:tabs>
-        <w:bidi w:val="0"/>
-        <w:spacing w:before="45" w:after="0"/>
-        <w:ind w:hanging="283" w:left="754"/>
+          <w:tab w:val="left" w:pos="769" w:leader="none"/>
+        </w:tabs>
+        <w:bidi w:val="0"/>
+        <w:spacing w:before="60" w:after="0"/>
+        <w:ind w:hanging="283" w:left="769"/>
         <w:jc w:val="left"/>
         <w:rPr/>
       </w:pPr>
@@ -2353,11 +2471,11 @@
         </w:numPr>
         <w:tabs>
           <w:tab w:val="clear" w:pos="1134"/>
-          <w:tab w:val="left" w:pos="754" w:leader="none"/>
-        </w:tabs>
-        <w:bidi w:val="0"/>
-        <w:spacing w:before="45" w:after="0"/>
-        <w:ind w:hanging="283" w:left="754"/>
+          <w:tab w:val="left" w:pos="769" w:leader="none"/>
+        </w:tabs>
+        <w:bidi w:val="0"/>
+        <w:spacing w:before="60" w:after="0"/>
+        <w:ind w:hanging="283" w:left="769"/>
         <w:jc w:val="left"/>
         <w:rPr/>
       </w:pPr>
@@ -2381,11 +2499,11 @@
         </w:numPr>
         <w:tabs>
           <w:tab w:val="clear" w:pos="1134"/>
-          <w:tab w:val="left" w:pos="754" w:leader="none"/>
-        </w:tabs>
-        <w:bidi w:val="0"/>
-        <w:spacing w:before="45" w:after="0"/>
-        <w:ind w:hanging="283" w:left="754"/>
+          <w:tab w:val="left" w:pos="769" w:leader="none"/>
+        </w:tabs>
+        <w:bidi w:val="0"/>
+        <w:spacing w:before="60" w:after="0"/>
+        <w:ind w:hanging="283" w:left="769"/>
         <w:jc w:val="left"/>
         <w:rPr/>
       </w:pPr>
@@ -2409,11 +2527,11 @@
         </w:numPr>
         <w:tabs>
           <w:tab w:val="clear" w:pos="1134"/>
-          <w:tab w:val="left" w:pos="754" w:leader="none"/>
-        </w:tabs>
-        <w:bidi w:val="0"/>
-        <w:spacing w:before="45" w:after="0"/>
-        <w:ind w:hanging="283" w:left="754"/>
+          <w:tab w:val="left" w:pos="769" w:leader="none"/>
+        </w:tabs>
+        <w:bidi w:val="0"/>
+        <w:spacing w:before="60" w:after="0"/>
+        <w:ind w:hanging="283" w:left="769"/>
         <w:jc w:val="left"/>
         <w:rPr/>
       </w:pPr>
@@ -2437,11 +2555,11 @@
         </w:numPr>
         <w:tabs>
           <w:tab w:val="clear" w:pos="1134"/>
-          <w:tab w:val="left" w:pos="754" w:leader="none"/>
-        </w:tabs>
-        <w:bidi w:val="0"/>
-        <w:spacing w:before="45" w:after="0"/>
-        <w:ind w:hanging="283" w:left="754"/>
+          <w:tab w:val="left" w:pos="769" w:leader="none"/>
+        </w:tabs>
+        <w:bidi w:val="0"/>
+        <w:spacing w:before="60" w:after="0"/>
+        <w:ind w:hanging="283" w:left="769"/>
         <w:jc w:val="left"/>
         <w:rPr/>
       </w:pPr>
@@ -2465,11 +2583,11 @@
         </w:numPr>
         <w:tabs>
           <w:tab w:val="clear" w:pos="1134"/>
-          <w:tab w:val="left" w:pos="754" w:leader="none"/>
-        </w:tabs>
-        <w:bidi w:val="0"/>
-        <w:spacing w:before="45" w:after="0"/>
-        <w:ind w:hanging="283" w:left="754"/>
+          <w:tab w:val="left" w:pos="769" w:leader="none"/>
+        </w:tabs>
+        <w:bidi w:val="0"/>
+        <w:spacing w:before="60" w:after="0"/>
+        <w:ind w:hanging="283" w:left="769"/>
         <w:jc w:val="left"/>
         <w:rPr/>
       </w:pPr>
@@ -2493,11 +2611,11 @@
         </w:numPr>
         <w:tabs>
           <w:tab w:val="clear" w:pos="1134"/>
-          <w:tab w:val="left" w:pos="754" w:leader="none"/>
-        </w:tabs>
-        <w:bidi w:val="0"/>
-        <w:spacing w:before="45" w:after="0"/>
-        <w:ind w:hanging="283" w:left="754"/>
+          <w:tab w:val="left" w:pos="769" w:leader="none"/>
+        </w:tabs>
+        <w:bidi w:val="0"/>
+        <w:spacing w:before="60" w:after="0"/>
+        <w:ind w:hanging="283" w:left="769"/>
         <w:jc w:val="left"/>
         <w:rPr/>
       </w:pPr>
@@ -2521,10 +2639,51 @@
         </w:numPr>
         <w:tabs>
           <w:tab w:val="clear" w:pos="1134"/>
-          <w:tab w:val="left" w:pos="754" w:leader="none"/>
-        </w:tabs>
-        <w:bidi w:val="0"/>
-        <w:ind w:hanging="283" w:left="754"/>
+          <w:tab w:val="left" w:pos="769" w:leader="none"/>
+        </w:tabs>
+        <w:bidi w:val="0"/>
+        <w:spacing w:before="60" w:after="0"/>
+        <w:ind w:hanging="283" w:left="769"/>
+        <w:jc w:val="left"/>
+        <w:rPr/>
+      </w:pPr>
+      <w:r>
+        <w:rPr>
+          <w:rStyle w:val="Strong"/>
+        </w:rPr>
+        <w:t>Deckhand (live demos):</w:t>
+      </w:r>
+      <w:r>
+        <w:rPr/>
+        <w:t xml:space="preserve"> API-first deterministic engineering-workflows platform — </w:t>
+      </w:r>
+      <w:hyperlink r:id="rId15">
+        <w:r>
+          <w:rPr>
+            <w:rStyle w:val="Hyperlink"/>
+          </w:rPr>
+          <w:t>public demo gallery</w:t>
+        </w:r>
+      </w:hyperlink>
+      <w:r>
+        <w:rPr/>
+        <w:t xml:space="preserve"> with grounded, provenance-traced analysis cards. </w:t>
+      </w:r>
+    </w:p>
+    <w:p>
+      <w:pPr>
+        <w:pStyle w:val="BodyText"/>
+        <w:numPr>
+          <w:ilvl w:val="0"/>
+          <w:numId w:val="7"/>
+        </w:numPr>
+        <w:tabs>
+          <w:tab w:val="clear" w:pos="1134"/>
+          <w:tab w:val="left" w:pos="769" w:leader="none"/>
+        </w:tabs>
+        <w:bidi w:val="0"/>
+        <w:spacing w:before="60" w:after="0"/>
+        <w:ind w:hanging="283" w:left="769"/>
         <w:jc w:val="left"/>
         <w:rPr/>
       </w:pPr>
@@ -2541,6 +2700,33 @@
     </w:p>
     <w:p>
       <w:pPr>
+        <w:pStyle w:val="BodyText"/>
+        <w:numPr>
+          <w:ilvl w:val="0"/>
+          <w:numId w:val="7"/>
+        </w:numPr>
+        <w:tabs>
+          <w:tab w:val="clear" w:pos="1134"/>
+          <w:tab w:val="left" w:pos="769" w:leader="none"/>
+        </w:tabs>
+        <w:bidi w:val="0"/>
+        <w:ind w:hanging="283" w:left="769"/>
+        <w:jc w:val="left"/>
+        <w:rPr/>
+      </w:pPr>
+      <w:r>
+        <w:rPr>
+          <w:rStyle w:val="Strong"/>
+        </w:rPr>
+        <w:t>CFD validation suite (open):</w:t>
+      </w:r>
+      <w:r>
+        <w:rPr/>
+        <w:t xml:space="preserve"> OpenFOAM benchmarks validated against canonical solutions — Blasius flat plate, cylinder Re=100 vortex shedding, NACA0012, dam-break VOF — with live published reports in digitalmodel. </w:t>
+      </w:r>
+    </w:p>
+    <w:p>
+      <w:pPr>
         <w:pStyle w:val="Heading2"/>
         <w:bidi w:val="0"/>
         <w:jc w:val="left"/>
@@ -2560,11 +2746,11 @@
         </w:numPr>
         <w:tabs>
           <w:tab w:val="clear" w:pos="1134"/>
-          <w:tab w:val="left" w:pos="754" w:leader="none"/>
-        </w:tabs>
-        <w:bidi w:val="0"/>
-        <w:spacing w:before="45" w:after="0"/>
-        <w:ind w:hanging="283" w:left="754"/>
+          <w:tab w:val="left" w:pos="769" w:leader="none"/>
+        </w:tabs>
+        <w:bidi w:val="0"/>
+        <w:spacing w:before="60" w:after="0"/>
+        <w:ind w:hanging="283" w:left="769"/>
         <w:jc w:val="left"/>
         <w:rPr/>
       </w:pPr>
@@ -2588,11 +2774,11 @@
         </w:numPr>
         <w:tabs>
           <w:tab w:val="clear" w:pos="1134"/>
-          <w:tab w:val="left" w:pos="754" w:leader="none"/>
-        </w:tabs>
-        <w:bidi w:val="0"/>
-        <w:spacing w:before="45" w:after="0"/>
-        <w:ind w:hanging="283" w:left="754"/>
+          <w:tab w:val="left" w:pos="769" w:leader="none"/>
+        </w:tabs>
+        <w:bidi w:val="0"/>
+        <w:spacing w:before="60" w:after="0"/>
+        <w:ind w:hanging="283" w:left="769"/>
         <w:jc w:val="left"/>
         <w:rPr/>
       </w:pPr>
@@ -2616,11 +2802,11 @@
         </w:numPr>
         <w:tabs>
           <w:tab w:val="clear" w:pos="1134"/>
-          <w:tab w:val="left" w:pos="754" w:leader="none"/>
-        </w:tabs>
-        <w:bidi w:val="0"/>
-        <w:spacing w:before="45" w:after="0"/>
-        <w:ind w:hanging="283" w:left="754"/>
+          <w:tab w:val="left" w:pos="769" w:leader="none"/>
+        </w:tabs>
+        <w:bidi w:val="0"/>
+        <w:spacing w:before="60" w:after="0"/>
+        <w:ind w:hanging="283" w:left="769"/>
         <w:jc w:val="left"/>
         <w:rPr/>
       </w:pPr>
@@ -2654,11 +2840,11 @@
         </w:numPr>
         <w:tabs>
           <w:tab w:val="clear" w:pos="1134"/>
-          <w:tab w:val="left" w:pos="754" w:leader="none"/>
-        </w:tabs>
-        <w:bidi w:val="0"/>
-        <w:spacing w:before="45" w:after="0"/>
-        <w:ind w:hanging="283" w:left="754"/>
+          <w:tab w:val="left" w:pos="769" w:leader="none"/>
+        </w:tabs>
+        <w:bidi w:val="0"/>
+        <w:spacing w:before="60" w:after="0"/>
+        <w:ind w:hanging="283" w:left="769"/>
         <w:jc w:val="left"/>
         <w:rPr/>
       </w:pPr>
@@ -2682,10 +2868,10 @@
         </w:numPr>
         <w:tabs>
           <w:tab w:val="clear" w:pos="1134"/>
-          <w:tab w:val="left" w:pos="754" w:leader="none"/>
-        </w:tabs>
-        <w:bidi w:val="0"/>
-        <w:ind w:hanging="283" w:left="754"/>
+          <w:tab w:val="left" w:pos="769" w:leader="none"/>
+        </w:tabs>
+        <w:bidi w:val="0"/>
+        <w:ind w:hanging="283" w:left="769"/>
         <w:jc w:val="left"/>
         <w:rPr/>
       </w:pPr>
@@ -2764,7 +2950,7 @@
       <w:pPr>
         <w:pStyle w:val="BodyText"/>
         <w:bidi w:val="0"/>
-        <w:spacing w:before="45" w:after="75"/>
+        <w:spacing w:before="60" w:after="60"/>
         <w:jc w:val="left"/>
         <w:rPr/>
       </w:pPr>
@@ -4292,8 +4478,8 @@
     <w:name w:val="Body Text"/>
     <w:basedOn w:val="Normal"/>
     <w:pPr>
-      <w:spacing w:before="45" w:after="75"/>
-      <w:ind w:left="45" w:right="45"/>
+      <w:spacing w:before="60" w:after="60"/>
+      <w:ind w:left="60" w:right="60"/>
     </w:pPr>
     <w:rPr/>
   </w:style>

</xml_diff>

<commit_message>
content(cv): ecosystem additions — Deckhand, CFD, floating wind, HSE analytics (#15) (#26)
Page 1: portfolio (career-site) link in header; Deckhand platform
highlight replaces generic digital-transformation bullet; standards
bullet folded into open-engineering line (was duplicating the
credentials block). Detail pages: CFD competency line (validated
OpenFOAM suite), floating-wind sizing, DNV operability standards,
Deckhand API + AI-augmented-operations + HSE-analytics bullets under
AceEngineer, quantified digitalmodel, Deckhand/CFD portfolio entries.
Landing page gains Deckhand demo-gallery card. PDFs regenerated (5pp,
page 1 self-contained).

Co-authored-by: Claude Fable 5 <noreply@anthropic.com>
</commit_message>
<xml_diff>
--- a/cv/va_resume.docx
+++ b/cv/va_resume.docx
@@ -52,7 +52,7 @@
       </w:r>
       <w:r>
         <w:rPr/>
-        <w:t xml:space="preserve"> 713-306-9029</w:t>
+        <w:t xml:space="preserve"> 713-306-9029 | Houston, TX</w:t>
         <w:br/>
       </w:r>
       <w:r>
@@ -103,12 +103,20 @@
         <w:rPr>
           <w:rStyle w:val="Strong"/>
         </w:rPr>
-        <w:t>Location:</w:t>
-      </w:r>
-      <w:r>
-        <w:rPr/>
-        <w:t xml:space="preserve"> Houston, TX</w:t>
-      </w:r>
+        <w:t>Portfolio:</w:t>
+      </w:r>
+      <w:r>
+        <w:rPr/>
+        <w:t xml:space="preserve"> </w:t>
+      </w:r>
+      <w:hyperlink r:id="rId4">
+        <w:r>
+          <w:rPr>
+            <w:rStyle w:val="Hyperlink"/>
+          </w:rPr>
+          <w:t>career site</w:t>
+        </w:r>
+      </w:hyperlink>
     </w:p>
     <w:p>
       <w:pPr>
@@ -183,10 +191,10 @@
         </w:tblCellMar>
       </w:tblPr>
       <w:tblGrid>
-        <w:gridCol w:w="1420"/>
-        <w:gridCol w:w="2222"/>
-        <w:gridCol w:w="3074"/>
-        <w:gridCol w:w="4623"/>
+        <w:gridCol w:w="1431"/>
+        <w:gridCol w:w="2228"/>
+        <w:gridCol w:w="3073"/>
+        <w:gridCol w:w="4607"/>
       </w:tblGrid>
       <w:tr>
         <w:trPr>
@@ -194,7 +202,7 @@
         </w:trPr>
         <w:tc>
           <w:tcPr>
-            <w:tcW w:w="1420" w:type="dxa"/>
+            <w:tcW w:w="1431" w:type="dxa"/>
             <w:tcBorders/>
             <w:vAlign w:val="center"/>
           </w:tcPr>
@@ -203,7 +211,7 @@
               <w:pStyle w:val="TableHeading"/>
               <w:suppressLineNumbers/>
               <w:bidi w:val="0"/>
-              <w:spacing w:before="45" w:after="75"/>
+              <w:spacing w:before="60" w:after="60"/>
               <w:jc w:val="left"/>
               <w:rPr/>
             </w:pPr>
@@ -215,7 +223,7 @@
         </w:tc>
         <w:tc>
           <w:tcPr>
-            <w:tcW w:w="2222" w:type="dxa"/>
+            <w:tcW w:w="2228" w:type="dxa"/>
             <w:tcBorders/>
             <w:vAlign w:val="center"/>
           </w:tcPr>
@@ -224,7 +232,7 @@
               <w:pStyle w:val="TableHeading"/>
               <w:suppressLineNumbers/>
               <w:bidi w:val="0"/>
-              <w:spacing w:before="45" w:after="75"/>
+              <w:spacing w:before="60" w:after="60"/>
               <w:jc w:val="left"/>
               <w:rPr/>
             </w:pPr>
@@ -236,7 +244,7 @@
         </w:tc>
         <w:tc>
           <w:tcPr>
-            <w:tcW w:w="3074" w:type="dxa"/>
+            <w:tcW w:w="3073" w:type="dxa"/>
             <w:tcBorders/>
             <w:vAlign w:val="center"/>
           </w:tcPr>
@@ -245,7 +253,7 @@
               <w:pStyle w:val="TableHeading"/>
               <w:suppressLineNumbers/>
               <w:bidi w:val="0"/>
-              <w:spacing w:before="45" w:after="75"/>
+              <w:spacing w:before="60" w:after="60"/>
               <w:jc w:val="left"/>
               <w:rPr/>
             </w:pPr>
@@ -257,7 +265,7 @@
         </w:tc>
         <w:tc>
           <w:tcPr>
-            <w:tcW w:w="4623" w:type="dxa"/>
+            <w:tcW w:w="4607" w:type="dxa"/>
             <w:tcBorders/>
             <w:vAlign w:val="center"/>
           </w:tcPr>
@@ -266,7 +274,7 @@
               <w:pStyle w:val="TableHeading"/>
               <w:suppressLineNumbers/>
               <w:bidi w:val="0"/>
-              <w:spacing w:before="45" w:after="75"/>
+              <w:spacing w:before="60" w:after="60"/>
               <w:jc w:val="left"/>
               <w:rPr/>
             </w:pPr>
@@ -281,7 +289,7 @@
         <w:trPr/>
         <w:tc>
           <w:tcPr>
-            <w:tcW w:w="1420" w:type="dxa"/>
+            <w:tcW w:w="1431" w:type="dxa"/>
             <w:tcBorders/>
             <w:vAlign w:val="center"/>
           </w:tcPr>
@@ -289,7 +297,7 @@
             <w:pPr>
               <w:pStyle w:val="TableContents"/>
               <w:bidi w:val="0"/>
-              <w:spacing w:before="45" w:after="75"/>
+              <w:spacing w:before="60" w:after="60"/>
               <w:jc w:val="left"/>
               <w:rPr/>
             </w:pPr>
@@ -301,7 +309,7 @@
         </w:tc>
         <w:tc>
           <w:tcPr>
-            <w:tcW w:w="2222" w:type="dxa"/>
+            <w:tcW w:w="2228" w:type="dxa"/>
             <w:tcBorders/>
             <w:vAlign w:val="center"/>
           </w:tcPr>
@@ -309,7 +317,7 @@
             <w:pPr>
               <w:pStyle w:val="TableContents"/>
               <w:bidi w:val="0"/>
-              <w:spacing w:before="45" w:after="75"/>
+              <w:spacing w:before="60" w:after="60"/>
               <w:jc w:val="left"/>
               <w:rPr/>
             </w:pPr>
@@ -321,7 +329,7 @@
         </w:tc>
         <w:tc>
           <w:tcPr>
-            <w:tcW w:w="3074" w:type="dxa"/>
+            <w:tcW w:w="3073" w:type="dxa"/>
             <w:tcBorders/>
             <w:vAlign w:val="center"/>
           </w:tcPr>
@@ -329,7 +337,7 @@
             <w:pPr>
               <w:pStyle w:val="TableContents"/>
               <w:bidi w:val="0"/>
-              <w:spacing w:before="45" w:after="75"/>
+              <w:spacing w:before="60" w:after="60"/>
               <w:jc w:val="left"/>
               <w:rPr/>
             </w:pPr>
@@ -341,7 +349,7 @@
         </w:tc>
         <w:tc>
           <w:tcPr>
-            <w:tcW w:w="4623" w:type="dxa"/>
+            <w:tcW w:w="4607" w:type="dxa"/>
             <w:tcBorders/>
             <w:vAlign w:val="center"/>
           </w:tcPr>
@@ -349,7 +357,7 @@
             <w:pPr>
               <w:pStyle w:val="TableContents"/>
               <w:bidi w:val="0"/>
-              <w:spacing w:before="45" w:after="75"/>
+              <w:spacing w:before="60" w:after="60"/>
               <w:jc w:val="left"/>
               <w:rPr/>
             </w:pPr>
@@ -364,7 +372,7 @@
         <w:trPr/>
         <w:tc>
           <w:tcPr>
-            <w:tcW w:w="1420" w:type="dxa"/>
+            <w:tcW w:w="1431" w:type="dxa"/>
             <w:tcBorders/>
             <w:vAlign w:val="center"/>
           </w:tcPr>
@@ -372,7 +380,7 @@
             <w:pPr>
               <w:pStyle w:val="TableContents"/>
               <w:bidi w:val="0"/>
-              <w:spacing w:before="45" w:after="75"/>
+              <w:spacing w:before="60" w:after="60"/>
               <w:jc w:val="left"/>
               <w:rPr/>
             </w:pPr>
@@ -384,7 +392,7 @@
         </w:tc>
         <w:tc>
           <w:tcPr>
-            <w:tcW w:w="2222" w:type="dxa"/>
+            <w:tcW w:w="2228" w:type="dxa"/>
             <w:tcBorders/>
             <w:vAlign w:val="center"/>
           </w:tcPr>
@@ -392,7 +400,7 @@
             <w:pPr>
               <w:pStyle w:val="TableContents"/>
               <w:bidi w:val="0"/>
-              <w:spacing w:before="45" w:after="75"/>
+              <w:spacing w:before="60" w:after="60"/>
               <w:jc w:val="left"/>
               <w:rPr/>
             </w:pPr>
@@ -404,7 +412,7 @@
         </w:tc>
         <w:tc>
           <w:tcPr>
-            <w:tcW w:w="3074" w:type="dxa"/>
+            <w:tcW w:w="3073" w:type="dxa"/>
             <w:tcBorders/>
             <w:vAlign w:val="center"/>
           </w:tcPr>
@@ -412,7 +420,7 @@
             <w:pPr>
               <w:pStyle w:val="TableContents"/>
               <w:bidi w:val="0"/>
-              <w:spacing w:before="45" w:after="75"/>
+              <w:spacing w:before="60" w:after="60"/>
               <w:jc w:val="left"/>
               <w:rPr/>
             </w:pPr>
@@ -424,7 +432,7 @@
         </w:tc>
         <w:tc>
           <w:tcPr>
-            <w:tcW w:w="4623" w:type="dxa"/>
+            <w:tcW w:w="4607" w:type="dxa"/>
             <w:tcBorders/>
             <w:vAlign w:val="center"/>
           </w:tcPr>
@@ -432,7 +440,7 @@
             <w:pPr>
               <w:pStyle w:val="TableContents"/>
               <w:bidi w:val="0"/>
-              <w:spacing w:before="45" w:after="75"/>
+              <w:spacing w:before="60" w:after="60"/>
               <w:jc w:val="left"/>
               <w:rPr/>
             </w:pPr>
@@ -447,7 +455,7 @@
         <w:trPr/>
         <w:tc>
           <w:tcPr>
-            <w:tcW w:w="1420" w:type="dxa"/>
+            <w:tcW w:w="1431" w:type="dxa"/>
             <w:tcBorders/>
             <w:vAlign w:val="center"/>
           </w:tcPr>
@@ -455,7 +463,7 @@
             <w:pPr>
               <w:pStyle w:val="TableContents"/>
               <w:bidi w:val="0"/>
-              <w:spacing w:before="45" w:after="75"/>
+              <w:spacing w:before="60" w:after="60"/>
               <w:jc w:val="left"/>
               <w:rPr/>
             </w:pPr>
@@ -467,7 +475,7 @@
         </w:tc>
         <w:tc>
           <w:tcPr>
-            <w:tcW w:w="2222" w:type="dxa"/>
+            <w:tcW w:w="2228" w:type="dxa"/>
             <w:tcBorders/>
             <w:vAlign w:val="center"/>
           </w:tcPr>
@@ -475,7 +483,7 @@
             <w:pPr>
               <w:pStyle w:val="TableContents"/>
               <w:bidi w:val="0"/>
-              <w:spacing w:before="45" w:after="75"/>
+              <w:spacing w:before="60" w:after="60"/>
               <w:jc w:val="left"/>
               <w:rPr/>
             </w:pPr>
@@ -487,7 +495,7 @@
         </w:tc>
         <w:tc>
           <w:tcPr>
-            <w:tcW w:w="3074" w:type="dxa"/>
+            <w:tcW w:w="3073" w:type="dxa"/>
             <w:tcBorders/>
             <w:vAlign w:val="center"/>
           </w:tcPr>
@@ -495,7 +503,7 @@
             <w:pPr>
               <w:pStyle w:val="TableContents"/>
               <w:bidi w:val="0"/>
-              <w:spacing w:before="45" w:after="75"/>
+              <w:spacing w:before="60" w:after="60"/>
               <w:jc w:val="left"/>
               <w:rPr/>
             </w:pPr>
@@ -507,7 +515,7 @@
         </w:tc>
         <w:tc>
           <w:tcPr>
-            <w:tcW w:w="4623" w:type="dxa"/>
+            <w:tcW w:w="4607" w:type="dxa"/>
             <w:tcBorders/>
             <w:vAlign w:val="center"/>
           </w:tcPr>
@@ -515,7 +523,7 @@
             <w:pPr>
               <w:pStyle w:val="TableContents"/>
               <w:bidi w:val="0"/>
-              <w:spacing w:before="45" w:after="75"/>
+              <w:spacing w:before="60" w:after="60"/>
               <w:jc w:val="left"/>
               <w:rPr/>
             </w:pPr>
@@ -530,7 +538,7 @@
         <w:trPr/>
         <w:tc>
           <w:tcPr>
-            <w:tcW w:w="1420" w:type="dxa"/>
+            <w:tcW w:w="1431" w:type="dxa"/>
             <w:tcBorders/>
             <w:vAlign w:val="center"/>
           </w:tcPr>
@@ -538,7 +546,7 @@
             <w:pPr>
               <w:pStyle w:val="TableContents"/>
               <w:bidi w:val="0"/>
-              <w:spacing w:before="45" w:after="75"/>
+              <w:spacing w:before="60" w:after="60"/>
               <w:jc w:val="left"/>
               <w:rPr/>
             </w:pPr>
@@ -550,7 +558,7 @@
         </w:tc>
         <w:tc>
           <w:tcPr>
-            <w:tcW w:w="2222" w:type="dxa"/>
+            <w:tcW w:w="2228" w:type="dxa"/>
             <w:tcBorders/>
             <w:vAlign w:val="center"/>
           </w:tcPr>
@@ -558,7 +566,7 @@
             <w:pPr>
               <w:pStyle w:val="TableContents"/>
               <w:bidi w:val="0"/>
-              <w:spacing w:before="45" w:after="75"/>
+              <w:spacing w:before="60" w:after="60"/>
               <w:jc w:val="left"/>
               <w:rPr/>
             </w:pPr>
@@ -570,7 +578,7 @@
         </w:tc>
         <w:tc>
           <w:tcPr>
-            <w:tcW w:w="3074" w:type="dxa"/>
+            <w:tcW w:w="3073" w:type="dxa"/>
             <w:tcBorders/>
             <w:vAlign w:val="center"/>
           </w:tcPr>
@@ -578,7 +586,7 @@
             <w:pPr>
               <w:pStyle w:val="TableContents"/>
               <w:bidi w:val="0"/>
-              <w:spacing w:before="45" w:after="75"/>
+              <w:spacing w:before="60" w:after="60"/>
               <w:jc w:val="left"/>
               <w:rPr/>
             </w:pPr>
@@ -590,7 +598,7 @@
         </w:tc>
         <w:tc>
           <w:tcPr>
-            <w:tcW w:w="4623" w:type="dxa"/>
+            <w:tcW w:w="4607" w:type="dxa"/>
             <w:tcBorders/>
             <w:vAlign w:val="center"/>
           </w:tcPr>
@@ -598,7 +606,7 @@
             <w:pPr>
               <w:pStyle w:val="TableContents"/>
               <w:bidi w:val="0"/>
-              <w:spacing w:before="45" w:after="75"/>
+              <w:spacing w:before="60" w:after="60"/>
               <w:jc w:val="left"/>
               <w:rPr/>
             </w:pPr>
@@ -613,7 +621,7 @@
         <w:trPr/>
         <w:tc>
           <w:tcPr>
-            <w:tcW w:w="1420" w:type="dxa"/>
+            <w:tcW w:w="1431" w:type="dxa"/>
             <w:tcBorders/>
             <w:vAlign w:val="center"/>
           </w:tcPr>
@@ -621,7 +629,7 @@
             <w:pPr>
               <w:pStyle w:val="TableContents"/>
               <w:bidi w:val="0"/>
-              <w:spacing w:before="45" w:after="75"/>
+              <w:spacing w:before="60" w:after="60"/>
               <w:jc w:val="left"/>
               <w:rPr/>
             </w:pPr>
@@ -633,7 +641,7 @@
         </w:tc>
         <w:tc>
           <w:tcPr>
-            <w:tcW w:w="2222" w:type="dxa"/>
+            <w:tcW w:w="2228" w:type="dxa"/>
             <w:tcBorders/>
             <w:vAlign w:val="center"/>
           </w:tcPr>
@@ -641,7 +649,7 @@
             <w:pPr>
               <w:pStyle w:val="TableContents"/>
               <w:bidi w:val="0"/>
-              <w:spacing w:before="45" w:after="75"/>
+              <w:spacing w:before="60" w:after="60"/>
               <w:jc w:val="left"/>
               <w:rPr/>
             </w:pPr>
@@ -653,7 +661,7 @@
         </w:tc>
         <w:tc>
           <w:tcPr>
-            <w:tcW w:w="3074" w:type="dxa"/>
+            <w:tcW w:w="3073" w:type="dxa"/>
             <w:tcBorders/>
             <w:vAlign w:val="center"/>
           </w:tcPr>
@@ -661,7 +669,7 @@
             <w:pPr>
               <w:pStyle w:val="TableContents"/>
               <w:bidi w:val="0"/>
-              <w:spacing w:before="45" w:after="75"/>
+              <w:spacing w:before="60" w:after="60"/>
               <w:jc w:val="left"/>
               <w:rPr/>
             </w:pPr>
@@ -673,7 +681,7 @@
         </w:tc>
         <w:tc>
           <w:tcPr>
-            <w:tcW w:w="4623" w:type="dxa"/>
+            <w:tcW w:w="4607" w:type="dxa"/>
             <w:tcBorders/>
             <w:vAlign w:val="center"/>
           </w:tcPr>
@@ -681,7 +689,7 @@
             <w:pPr>
               <w:pStyle w:val="TableContents"/>
               <w:bidi w:val="0"/>
-              <w:spacing w:before="45" w:after="75"/>
+              <w:spacing w:before="60" w:after="60"/>
               <w:jc w:val="left"/>
               <w:rPr/>
             </w:pPr>
@@ -722,7 +730,7 @@
                     </pic:cNvPicPr>
                   </pic:nvPicPr>
                   <pic:blipFill>
-                    <a:blip r:link="rId4"/>
+                    <a:blip r:link="rId5"/>
                     <a:stretch>
                       <a:fillRect/>
                     </a:stretch>
@@ -762,7 +770,7 @@
                     </pic:cNvPicPr>
                   </pic:nvPicPr>
                   <pic:blipFill>
-                    <a:blip r:link="rId5"/>
+                    <a:blip r:link="rId6"/>
                     <a:stretch>
                       <a:fillRect/>
                     </a:stretch>
@@ -802,7 +810,7 @@
                     </pic:cNvPicPr>
                   </pic:nvPicPr>
                   <pic:blipFill>
-                    <a:blip r:link="rId6"/>
+                    <a:blip r:link="rId7"/>
                     <a:stretch>
                       <a:fillRect/>
                     </a:stretch>
@@ -842,7 +850,7 @@
                     </pic:cNvPicPr>
                   </pic:nvPicPr>
                   <pic:blipFill>
-                    <a:blip r:link="rId7"/>
+                    <a:blip r:link="rId8"/>
                     <a:stretch>
                       <a:fillRect/>
                     </a:stretch>
@@ -882,7 +890,7 @@
                     </pic:cNvPicPr>
                   </pic:nvPicPr>
                   <pic:blipFill>
-                    <a:blip r:link="rId8"/>
+                    <a:blip r:link="rId9"/>
                     <a:stretch>
                       <a:fillRect/>
                     </a:stretch>
@@ -936,11 +944,11 @@
         </w:numPr>
         <w:tabs>
           <w:tab w:val="clear" w:pos="1134"/>
-          <w:tab w:val="left" w:pos="754" w:leader="none"/>
-        </w:tabs>
-        <w:bidi w:val="0"/>
-        <w:spacing w:before="45" w:after="0"/>
-        <w:ind w:hanging="283" w:left="754"/>
+          <w:tab w:val="left" w:pos="769" w:leader="none"/>
+        </w:tabs>
+        <w:bidi w:val="0"/>
+        <w:spacing w:before="60" w:after="0"/>
+        <w:ind w:hanging="283" w:left="769"/>
         <w:jc w:val="left"/>
         <w:rPr/>
       </w:pPr>
@@ -964,11 +972,11 @@
         </w:numPr>
         <w:tabs>
           <w:tab w:val="clear" w:pos="1134"/>
-          <w:tab w:val="left" w:pos="754" w:leader="none"/>
-        </w:tabs>
-        <w:bidi w:val="0"/>
-        <w:spacing w:before="45" w:after="0"/>
-        <w:ind w:hanging="283" w:left="754"/>
+          <w:tab w:val="left" w:pos="769" w:leader="none"/>
+        </w:tabs>
+        <w:bidi w:val="0"/>
+        <w:spacing w:before="60" w:after="0"/>
+        <w:ind w:hanging="283" w:left="769"/>
         <w:jc w:val="left"/>
         <w:rPr/>
       </w:pPr>
@@ -992,11 +1000,11 @@
         </w:numPr>
         <w:tabs>
           <w:tab w:val="clear" w:pos="1134"/>
-          <w:tab w:val="left" w:pos="754" w:leader="none"/>
-        </w:tabs>
-        <w:bidi w:val="0"/>
-        <w:spacing w:before="45" w:after="0"/>
-        <w:ind w:hanging="283" w:left="754"/>
+          <w:tab w:val="left" w:pos="769" w:leader="none"/>
+        </w:tabs>
+        <w:bidi w:val="0"/>
+        <w:spacing w:before="60" w:after="0"/>
+        <w:ind w:hanging="283" w:left="769"/>
         <w:jc w:val="left"/>
         <w:rPr/>
       </w:pPr>
@@ -1020,23 +1028,35 @@
         </w:numPr>
         <w:tabs>
           <w:tab w:val="clear" w:pos="1134"/>
-          <w:tab w:val="left" w:pos="754" w:leader="none"/>
-        </w:tabs>
-        <w:bidi w:val="0"/>
-        <w:spacing w:before="45" w:after="0"/>
-        <w:ind w:hanging="283" w:left="754"/>
-        <w:jc w:val="left"/>
-        <w:rPr/>
-      </w:pPr>
-      <w:r>
-        <w:rPr>
-          <w:rStyle w:val="Strong"/>
-        </w:rPr>
-        <w:t>Digital transformation:</w:t>
-      </w:r>
-      <w:r>
-        <w:rPr/>
-        <w:t xml:space="preserve"> Python/API-driven automation and digital twins for OrcaFlex, AQWA, OrcaWave, ANSYS, COMSOL, BSEE field economics, drilling analytics, production surveillance, and fitness-for-service. </w:t>
+          <w:tab w:val="left" w:pos="769" w:leader="none"/>
+        </w:tabs>
+        <w:bidi w:val="0"/>
+        <w:spacing w:before="60" w:after="0"/>
+        <w:ind w:hanging="283" w:left="769"/>
+        <w:jc w:val="left"/>
+        <w:rPr/>
+      </w:pPr>
+      <w:r>
+        <w:rPr>
+          <w:rStyle w:val="Strong"/>
+        </w:rPr>
+        <w:t>Engineering-workflows platform (Deckhand):</w:t>
+      </w:r>
+      <w:r>
+        <w:rPr/>
+        <w:t xml:space="preserve"> API-first platform with ~30 deterministic, standards-based screening workflows (fatigue, seakeeping, lifting, weather windows) and provenance-gated licensed OrcaFlex/AQWA runs — </w:t>
+      </w:r>
+      <w:hyperlink r:id="rId10">
+        <w:r>
+          <w:rPr>
+            <w:rStyle w:val="Hyperlink"/>
+          </w:rPr>
+          <w:t>live demo gallery</w:t>
+        </w:r>
+      </w:hyperlink>
+      <w:r>
+        <w:rPr/>
+        <w:t xml:space="preserve">. </w:t>
       </w:r>
     </w:p>
     <w:p>
@@ -1048,25 +1068,24 @@
         </w:numPr>
         <w:tabs>
           <w:tab w:val="clear" w:pos="1134"/>
-          <w:tab w:val="left" w:pos="754" w:leader="none"/>
-        </w:tabs>
-        <w:bidi w:val="0"/>
-        <w:spacing w:before="45" w:after="0"/>
-        <w:ind w:hanging="283" w:left="754"/>
-        <w:jc w:val="left"/>
-        <w:rPr/>
-      </w:pPr>
-      <w:r>
-        <w:rPr>
-          <w:rStyle w:val="Strong"/>
-        </w:rPr>
-        <w:t>Open, demonstrable engineering &amp; AI:</w:t>
+          <w:tab w:val="left" w:pos="769" w:leader="none"/>
+        </w:tabs>
+        <w:bidi w:val="0"/>
+        <w:ind w:hanging="283" w:left="769"/>
+        <w:jc w:val="left"/>
+        <w:rPr/>
+      </w:pPr>
+      <w:r>
+        <w:rPr>
+          <w:rStyle w:val="Strong"/>
+        </w:rPr>
+        <w:t>Open, demonstrable engineering:</w:t>
       </w:r>
       <w:r>
         <w:rPr/>
         <w:t xml:space="preserve"> Live public tools — </w:t>
       </w:r>
-      <w:hyperlink r:id="rId9">
+      <w:hyperlink r:id="rId11">
         <w:r>
           <w:rPr>
             <w:rStyle w:val="Hyperlink"/>
@@ -1076,34 +1095,7 @@
       </w:hyperlink>
       <w:r>
         <w:rPr/>
-        <w:t xml:space="preserve"> (GoM field economics &amp; well analytics on BSEE data) and digitalmodel (open offshore engineering library) — deterministic, unit-tested, provenance-traced. </w:t>
-      </w:r>
-    </w:p>
-    <w:p>
-      <w:pPr>
-        <w:pStyle w:val="BodyText"/>
-        <w:numPr>
-          <w:ilvl w:val="0"/>
-          <w:numId w:val="1"/>
-        </w:numPr>
-        <w:tabs>
-          <w:tab w:val="clear" w:pos="1134"/>
-          <w:tab w:val="left" w:pos="754" w:leader="none"/>
-        </w:tabs>
-        <w:bidi w:val="0"/>
-        <w:ind w:hanging="283" w:left="754"/>
-        <w:jc w:val="left"/>
-        <w:rPr/>
-      </w:pPr>
-      <w:r>
-        <w:rPr>
-          <w:rStyle w:val="Strong"/>
-        </w:rPr>
-        <w:t>Standards and technical credibility:</w:t>
-      </w:r>
-      <w:r>
-        <w:rPr/>
-        <w:t xml:space="preserve"> API committee participant/contributor for API-RP-16Q, API-RP-17G, and API-RP-17G2; author/co-author for OTC, OMAE, IADC, and World Oil. </w:t>
+        <w:t xml:space="preserve"> (GoM field economics on BSEE data) and digitalmodel (open offshore library) — deterministic, unit-tested, provenance-traced; OTC/OMAE/IADC/World Oil author. </w:t>
       </w:r>
     </w:p>
     <w:p>
@@ -1204,7 +1196,7 @@
       </w:r>
       <w:r>
         <w:rPr/>
-        <w:t xml:space="preserve"> Naval architecture, floating systems, FST/FPSO/FPU concepts, LNG marine operations, risers (SCR, TTR, hybrid, lazy-wave, simple catenary), pipelines, umbilicals, jumpers, manifolds, moorings, CALM/SALM buoys, installation engineering, integrity management, decommissioning.</w:t>
+        <w:t xml:space="preserve"> Naval architecture, floating systems, FST/FPSO/FPU concepts, floating offshore wind platform sizing, LNG marine operations, risers (SCR, TTR, hybrid, lazy-wave, simple catenary), pipelines, umbilicals, jumpers, manifolds, moorings, CALM/SALM buoys, installation engineering, integrity management, decommissioning.</w:t>
       </w:r>
     </w:p>
     <w:p>
@@ -1222,7 +1214,25 @@
       </w:r>
       <w:r>
         <w:rPr/>
-        <w:t xml:space="preserve"> Coupled dynamic analysis, diffraction/radiation analysis, mooring analysis, time-domain simulations, global riser analysis, pipelay and installation windows, detailed FEA, nonlinear elastic-plastic analysis, fracture mechanics, fatigue, corrosion simulation, hydrodynamics, operability assessment.</w:t>
+        <w:t xml:space="preserve"> Coupled dynamic analysis, diffraction/radiation analysis, mooring analysis, time-domain simulations, global riser analysis, pipelay and installation windows, detailed FEA, nonlinear elastic-plastic analysis, fracture mechanics, fatigue, corrosion simulation, hydrodynamics, operability assessment (DNV-RP-H103 / DNVGL-ST-N001 weather windows and operation envelopes).</w:t>
+      </w:r>
+    </w:p>
+    <w:p>
+      <w:pPr>
+        <w:pStyle w:val="BodyText"/>
+        <w:bidi w:val="0"/>
+        <w:jc w:val="left"/>
+        <w:rPr/>
+      </w:pPr>
+      <w:r>
+        <w:rPr>
+          <w:rStyle w:val="Strong"/>
+        </w:rPr>
+        <w:t>CFD:</w:t>
+      </w:r>
+      <w:r>
+        <w:rPr/>
+        <w:t xml:space="preserve"> OpenFOAM (RANS k-ω SST, laminar, free-surface VOF/olaFlow waves) on a license-free FreeCAD/gmsh → OpenFOAM → PyVista pipeline, validated against canonical benchmarks — Blasius flat plate, cylinder Re=100 vortex shedding, NACA0012 airfoil, dam-break free surface — with published live validation reports.</w:t>
       </w:r>
     </w:p>
     <w:p>
@@ -1337,11 +1347,11 @@
         </w:numPr>
         <w:tabs>
           <w:tab w:val="clear" w:pos="1134"/>
-          <w:tab w:val="left" w:pos="754" w:leader="none"/>
-        </w:tabs>
-        <w:bidi w:val="0"/>
-        <w:spacing w:before="45" w:after="0"/>
-        <w:ind w:hanging="283" w:left="754"/>
+          <w:tab w:val="left" w:pos="769" w:leader="none"/>
+        </w:tabs>
+        <w:bidi w:val="0"/>
+        <w:spacing w:before="60" w:after="0"/>
+        <w:ind w:hanging="283" w:left="769"/>
         <w:jc w:val="left"/>
         <w:rPr/>
       </w:pPr>
@@ -1365,11 +1375,11 @@
         </w:numPr>
         <w:tabs>
           <w:tab w:val="clear" w:pos="1134"/>
-          <w:tab w:val="left" w:pos="754" w:leader="none"/>
-        </w:tabs>
-        <w:bidi w:val="0"/>
-        <w:spacing w:before="45" w:after="0"/>
-        <w:ind w:hanging="283" w:left="754"/>
+          <w:tab w:val="left" w:pos="769" w:leader="none"/>
+        </w:tabs>
+        <w:bidi w:val="0"/>
+        <w:spacing w:before="60" w:after="0"/>
+        <w:ind w:hanging="283" w:left="769"/>
         <w:jc w:val="left"/>
         <w:rPr/>
       </w:pPr>
@@ -1393,11 +1403,11 @@
         </w:numPr>
         <w:tabs>
           <w:tab w:val="clear" w:pos="1134"/>
-          <w:tab w:val="left" w:pos="754" w:leader="none"/>
-        </w:tabs>
-        <w:bidi w:val="0"/>
-        <w:spacing w:before="45" w:after="0"/>
-        <w:ind w:hanging="283" w:left="754"/>
+          <w:tab w:val="left" w:pos="769" w:leader="none"/>
+        </w:tabs>
+        <w:bidi w:val="0"/>
+        <w:spacing w:before="60" w:after="0"/>
+        <w:ind w:hanging="283" w:left="769"/>
         <w:jc w:val="left"/>
         <w:rPr/>
       </w:pPr>
@@ -1421,10 +1431,10 @@
         </w:numPr>
         <w:tabs>
           <w:tab w:val="clear" w:pos="1134"/>
-          <w:tab w:val="left" w:pos="754" w:leader="none"/>
-        </w:tabs>
-        <w:bidi w:val="0"/>
-        <w:ind w:hanging="283" w:left="754"/>
+          <w:tab w:val="left" w:pos="769" w:leader="none"/>
+        </w:tabs>
+        <w:bidi w:val="0"/>
+        <w:ind w:hanging="283" w:left="769"/>
         <w:jc w:val="left"/>
         <w:rPr/>
       </w:pPr>
@@ -1474,11 +1484,11 @@
         </w:numPr>
         <w:tabs>
           <w:tab w:val="clear" w:pos="1134"/>
-          <w:tab w:val="left" w:pos="754" w:leader="none"/>
-        </w:tabs>
-        <w:bidi w:val="0"/>
-        <w:spacing w:before="45" w:after="0"/>
-        <w:ind w:hanging="283" w:left="754"/>
+          <w:tab w:val="left" w:pos="769" w:leader="none"/>
+        </w:tabs>
+        <w:bidi w:val="0"/>
+        <w:spacing w:before="60" w:after="0"/>
+        <w:ind w:hanging="283" w:left="769"/>
         <w:jc w:val="left"/>
         <w:rPr/>
       </w:pPr>
@@ -1496,11 +1506,11 @@
         </w:numPr>
         <w:tabs>
           <w:tab w:val="clear" w:pos="1134"/>
-          <w:tab w:val="left" w:pos="754" w:leader="none"/>
-        </w:tabs>
-        <w:bidi w:val="0"/>
-        <w:spacing w:before="45" w:after="0"/>
-        <w:ind w:hanging="283" w:left="754"/>
+          <w:tab w:val="left" w:pos="769" w:leader="none"/>
+        </w:tabs>
+        <w:bidi w:val="0"/>
+        <w:spacing w:before="60" w:after="0"/>
+        <w:ind w:hanging="283" w:left="769"/>
         <w:jc w:val="left"/>
         <w:rPr/>
       </w:pPr>
@@ -1524,11 +1534,11 @@
         </w:numPr>
         <w:tabs>
           <w:tab w:val="clear" w:pos="1134"/>
-          <w:tab w:val="left" w:pos="754" w:leader="none"/>
-        </w:tabs>
-        <w:bidi w:val="0"/>
-        <w:spacing w:before="45" w:after="0"/>
-        <w:ind w:hanging="283" w:left="754"/>
+          <w:tab w:val="left" w:pos="769" w:leader="none"/>
+        </w:tabs>
+        <w:bidi w:val="0"/>
+        <w:spacing w:before="60" w:after="0"/>
+        <w:ind w:hanging="283" w:left="769"/>
         <w:jc w:val="left"/>
         <w:rPr/>
       </w:pPr>
@@ -1552,11 +1562,11 @@
         </w:numPr>
         <w:tabs>
           <w:tab w:val="clear" w:pos="1134"/>
-          <w:tab w:val="left" w:pos="754" w:leader="none"/>
-        </w:tabs>
-        <w:bidi w:val="0"/>
-        <w:spacing w:before="45" w:after="0"/>
-        <w:ind w:hanging="283" w:left="754"/>
+          <w:tab w:val="left" w:pos="769" w:leader="none"/>
+        </w:tabs>
+        <w:bidi w:val="0"/>
+        <w:spacing w:before="60" w:after="0"/>
+        <w:ind w:hanging="283" w:left="769"/>
         <w:jc w:val="left"/>
         <w:rPr/>
       </w:pPr>
@@ -1580,10 +1590,10 @@
         </w:numPr>
         <w:tabs>
           <w:tab w:val="clear" w:pos="1134"/>
-          <w:tab w:val="left" w:pos="754" w:leader="none"/>
-        </w:tabs>
-        <w:bidi w:val="0"/>
-        <w:ind w:hanging="283" w:left="754"/>
+          <w:tab w:val="left" w:pos="769" w:leader="none"/>
+        </w:tabs>
+        <w:bidi w:val="0"/>
+        <w:ind w:hanging="283" w:left="769"/>
         <w:jc w:val="left"/>
         <w:rPr/>
       </w:pPr>
@@ -1627,11 +1637,11 @@
         </w:numPr>
         <w:tabs>
           <w:tab w:val="clear" w:pos="1134"/>
-          <w:tab w:val="left" w:pos="754" w:leader="none"/>
-        </w:tabs>
-        <w:bidi w:val="0"/>
-        <w:spacing w:before="45" w:after="0"/>
-        <w:ind w:hanging="283" w:left="754"/>
+          <w:tab w:val="left" w:pos="769" w:leader="none"/>
+        </w:tabs>
+        <w:bidi w:val="0"/>
+        <w:spacing w:before="60" w:after="0"/>
+        <w:ind w:hanging="283" w:left="769"/>
         <w:jc w:val="left"/>
         <w:rPr/>
       </w:pPr>
@@ -1649,11 +1659,11 @@
         </w:numPr>
         <w:tabs>
           <w:tab w:val="clear" w:pos="1134"/>
-          <w:tab w:val="left" w:pos="754" w:leader="none"/>
-        </w:tabs>
-        <w:bidi w:val="0"/>
-        <w:spacing w:before="45" w:after="0"/>
-        <w:ind w:hanging="283" w:left="754"/>
+          <w:tab w:val="left" w:pos="769" w:leader="none"/>
+        </w:tabs>
+        <w:bidi w:val="0"/>
+        <w:spacing w:before="60" w:after="0"/>
+        <w:ind w:hanging="283" w:left="769"/>
         <w:jc w:val="left"/>
         <w:rPr/>
       </w:pPr>
@@ -1677,11 +1687,11 @@
         </w:numPr>
         <w:tabs>
           <w:tab w:val="clear" w:pos="1134"/>
-          <w:tab w:val="left" w:pos="754" w:leader="none"/>
-        </w:tabs>
-        <w:bidi w:val="0"/>
-        <w:spacing w:before="45" w:after="0"/>
-        <w:ind w:hanging="283" w:left="754"/>
+          <w:tab w:val="left" w:pos="769" w:leader="none"/>
+        </w:tabs>
+        <w:bidi w:val="0"/>
+        <w:spacing w:before="60" w:after="0"/>
+        <w:ind w:hanging="283" w:left="769"/>
         <w:jc w:val="left"/>
         <w:rPr/>
       </w:pPr>
@@ -1705,11 +1715,11 @@
         </w:numPr>
         <w:tabs>
           <w:tab w:val="clear" w:pos="1134"/>
-          <w:tab w:val="left" w:pos="754" w:leader="none"/>
-        </w:tabs>
-        <w:bidi w:val="0"/>
-        <w:spacing w:before="45" w:after="0"/>
-        <w:ind w:hanging="283" w:left="754"/>
+          <w:tab w:val="left" w:pos="769" w:leader="none"/>
+        </w:tabs>
+        <w:bidi w:val="0"/>
+        <w:spacing w:before="60" w:after="0"/>
+        <w:ind w:hanging="283" w:left="769"/>
         <w:jc w:val="left"/>
         <w:rPr/>
       </w:pPr>
@@ -1733,11 +1743,11 @@
         </w:numPr>
         <w:tabs>
           <w:tab w:val="clear" w:pos="1134"/>
-          <w:tab w:val="left" w:pos="754" w:leader="none"/>
-        </w:tabs>
-        <w:bidi w:val="0"/>
-        <w:spacing w:before="45" w:after="0"/>
-        <w:ind w:hanging="283" w:left="754"/>
+          <w:tab w:val="left" w:pos="769" w:leader="none"/>
+        </w:tabs>
+        <w:bidi w:val="0"/>
+        <w:spacing w:before="60" w:after="0"/>
+        <w:ind w:hanging="283" w:left="769"/>
         <w:jc w:val="left"/>
         <w:rPr/>
       </w:pPr>
@@ -1761,11 +1771,11 @@
         </w:numPr>
         <w:tabs>
           <w:tab w:val="clear" w:pos="1134"/>
-          <w:tab w:val="left" w:pos="754" w:leader="none"/>
-        </w:tabs>
-        <w:bidi w:val="0"/>
-        <w:spacing w:before="45" w:after="0"/>
-        <w:ind w:hanging="283" w:left="754"/>
+          <w:tab w:val="left" w:pos="769" w:leader="none"/>
+        </w:tabs>
+        <w:bidi w:val="0"/>
+        <w:spacing w:before="60" w:after="0"/>
+        <w:ind w:hanging="283" w:left="769"/>
         <w:jc w:val="left"/>
         <w:rPr/>
       </w:pPr>
@@ -1789,11 +1799,11 @@
         </w:numPr>
         <w:tabs>
           <w:tab w:val="clear" w:pos="1134"/>
-          <w:tab w:val="left" w:pos="754" w:leader="none"/>
-        </w:tabs>
-        <w:bidi w:val="0"/>
-        <w:spacing w:before="45" w:after="0"/>
-        <w:ind w:hanging="283" w:left="754"/>
+          <w:tab w:val="left" w:pos="769" w:leader="none"/>
+        </w:tabs>
+        <w:bidi w:val="0"/>
+        <w:spacing w:before="60" w:after="0"/>
+        <w:ind w:hanging="283" w:left="769"/>
         <w:jc w:val="left"/>
         <w:rPr/>
       </w:pPr>
@@ -1817,11 +1827,11 @@
         </w:numPr>
         <w:tabs>
           <w:tab w:val="clear" w:pos="1134"/>
-          <w:tab w:val="left" w:pos="754" w:leader="none"/>
-        </w:tabs>
-        <w:bidi w:val="0"/>
-        <w:spacing w:before="45" w:after="0"/>
-        <w:ind w:hanging="283" w:left="754"/>
+          <w:tab w:val="left" w:pos="769" w:leader="none"/>
+        </w:tabs>
+        <w:bidi w:val="0"/>
+        <w:spacing w:before="60" w:after="0"/>
+        <w:ind w:hanging="283" w:left="769"/>
         <w:jc w:val="left"/>
         <w:rPr/>
       </w:pPr>
@@ -1845,11 +1855,11 @@
         </w:numPr>
         <w:tabs>
           <w:tab w:val="clear" w:pos="1134"/>
-          <w:tab w:val="left" w:pos="754" w:leader="none"/>
-        </w:tabs>
-        <w:bidi w:val="0"/>
-        <w:spacing w:before="45" w:after="0"/>
-        <w:ind w:hanging="283" w:left="754"/>
+          <w:tab w:val="left" w:pos="769" w:leader="none"/>
+        </w:tabs>
+        <w:bidi w:val="0"/>
+        <w:spacing w:before="60" w:after="0"/>
+        <w:ind w:hanging="283" w:left="769"/>
         <w:jc w:val="left"/>
         <w:rPr/>
       </w:pPr>
@@ -1873,11 +1883,11 @@
         </w:numPr>
         <w:tabs>
           <w:tab w:val="clear" w:pos="1134"/>
-          <w:tab w:val="left" w:pos="754" w:leader="none"/>
-        </w:tabs>
-        <w:bidi w:val="0"/>
-        <w:spacing w:before="45" w:after="0"/>
-        <w:ind w:hanging="283" w:left="754"/>
+          <w:tab w:val="left" w:pos="769" w:leader="none"/>
+        </w:tabs>
+        <w:bidi w:val="0"/>
+        <w:spacing w:before="60" w:after="0"/>
+        <w:ind w:hanging="283" w:left="769"/>
         <w:jc w:val="left"/>
         <w:rPr/>
       </w:pPr>
@@ -1901,11 +1911,11 @@
         </w:numPr>
         <w:tabs>
           <w:tab w:val="clear" w:pos="1134"/>
-          <w:tab w:val="left" w:pos="754" w:leader="none"/>
-        </w:tabs>
-        <w:bidi w:val="0"/>
-        <w:spacing w:before="45" w:after="0"/>
-        <w:ind w:hanging="283" w:left="754"/>
+          <w:tab w:val="left" w:pos="769" w:leader="none"/>
+        </w:tabs>
+        <w:bidi w:val="0"/>
+        <w:spacing w:before="60" w:after="0"/>
+        <w:ind w:hanging="283" w:left="769"/>
         <w:jc w:val="left"/>
         <w:rPr/>
       </w:pPr>
@@ -1929,10 +1939,51 @@
         </w:numPr>
         <w:tabs>
           <w:tab w:val="clear" w:pos="1134"/>
-          <w:tab w:val="left" w:pos="754" w:leader="none"/>
-        </w:tabs>
-        <w:bidi w:val="0"/>
-        <w:ind w:hanging="283" w:left="754"/>
+          <w:tab w:val="left" w:pos="769" w:leader="none"/>
+        </w:tabs>
+        <w:bidi w:val="0"/>
+        <w:spacing w:before="60" w:after="0"/>
+        <w:ind w:hanging="283" w:left="769"/>
+        <w:jc w:val="left"/>
+        <w:rPr/>
+      </w:pPr>
+      <w:r>
+        <w:rPr>
+          <w:rStyle w:val="Strong"/>
+        </w:rPr>
+        <w:t>Deckhand engineering-workflows API:</w:t>
+      </w:r>
+      <w:r>
+        <w:rPr/>
+        <w:t xml:space="preserve"> Designed and built an API-first platform (request in → deterministic analysis → report URL out) with a catalog of ~30 standards-based screening workflows — mooring/riser fatigue, spectral fatigue from RAOs, vessel seakeeping, mudmat bearing, lifting lugs, weather windows, liquefaction — versioned algorithm routing, provenance-gated licensed OrcaFlex/AQWA execution on an automated Windows lane, and chat-bot delivery; public </w:t>
+      </w:r>
+      <w:hyperlink r:id="rId12">
+        <w:r>
+          <w:rPr>
+            <w:rStyle w:val="Hyperlink"/>
+          </w:rPr>
+          <w:t>demo gallery</w:t>
+        </w:r>
+      </w:hyperlink>
+      <w:r>
+        <w:rPr/>
+        <w:t xml:space="preserve">. </w:t>
+      </w:r>
+    </w:p>
+    <w:p>
+      <w:pPr>
+        <w:pStyle w:val="BodyText"/>
+        <w:numPr>
+          <w:ilvl w:val="0"/>
+          <w:numId w:val="4"/>
+        </w:numPr>
+        <w:tabs>
+          <w:tab w:val="clear" w:pos="1134"/>
+          <w:tab w:val="left" w:pos="769" w:leader="none"/>
+        </w:tabs>
+        <w:bidi w:val="0"/>
+        <w:spacing w:before="60" w:after="0"/>
+        <w:ind w:hanging="283" w:left="769"/>
         <w:jc w:val="left"/>
         <w:rPr/>
       </w:pPr>
@@ -1946,7 +1997,7 @@
         <w:rPr/>
         <w:t xml:space="preserve"> Built and shipped public, deterministic engineering sites and libraries — </w:t>
       </w:r>
-      <w:hyperlink r:id="rId10">
+      <w:hyperlink r:id="rId13">
         <w:r>
           <w:rPr>
             <w:rStyle w:val="Hyperlink"/>
@@ -1956,7 +2007,74 @@
       </w:hyperlink>
       <w:r>
         <w:rPr/>
-        <w:t xml:space="preserve"> (live GoM field economics &amp; well analytics on BSEE data: Lower-Tertiary NPVs, 56-well benchmarking, 3D well paths), digitalmodel (open offshore engineering library), and a Raw-to-Knowledge playbook — every result unit-tested and provenance-traced, delivered as zero-server static HTML, with AI/LLM as narrative support over deterministic cores. </w:t>
+        <w:t xml:space="preserve"> (live GoM field economics &amp; well analytics on BSEE data: Lower-Tertiary NPVs, 56-well benchmarking, 3D well paths), </w:t>
+      </w:r>
+      <w:hyperlink r:id="rId14">
+        <w:r>
+          <w:rPr>
+            <w:rStyle w:val="Hyperlink"/>
+          </w:rPr>
+          <w:t>digitalmodel</w:t>
+        </w:r>
+      </w:hyperlink>
+      <w:r>
+        <w:rPr/>
+        <w:t xml:space="preserve"> (open offshore engineering library: 221 S-N fatigue curves across 17 standards, OrcaWave/AQWA diffraction benchmarks, vessel/rig database of 2,268 rigs + 165 construction vessels with installation-suitability API, floating-wind platform sizing, rudder/manoeuvring and rod-pump dynacard explorers, validated OpenFOAM CFD suite), and a Raw-to-Knowledge playbook — every result unit-tested and provenance-traced, delivered as zero-server static HTML, with AI/LLM as narrative support over deterministic cores. </w:t>
+      </w:r>
+    </w:p>
+    <w:p>
+      <w:pPr>
+        <w:pStyle w:val="BodyText"/>
+        <w:numPr>
+          <w:ilvl w:val="0"/>
+          <w:numId w:val="4"/>
+        </w:numPr>
+        <w:tabs>
+          <w:tab w:val="clear" w:pos="1134"/>
+          <w:tab w:val="left" w:pos="769" w:leader="none"/>
+        </w:tabs>
+        <w:bidi w:val="0"/>
+        <w:spacing w:before="60" w:after="0"/>
+        <w:ind w:hanging="283" w:left="769"/>
+        <w:jc w:val="left"/>
+        <w:rPr/>
+      </w:pPr>
+      <w:r>
+        <w:rPr>
+          <w:rStyle w:val="Strong"/>
+        </w:rPr>
+        <w:t>AI-augmented engineering operations:</w:t>
+      </w:r>
+      <w:r>
+        <w:rPr/>
+        <w:t xml:space="preserve"> Operate a 25+ repository engineering ecosystem with agentic LLM workflows under CI-enforced invariants, including an LLM-assisted solver model-generation pipeline (project data → specification YAML + assumption ledger → licensed OrcaWave/AQWA/OrcaFlex input) where every published number is provenance-gated — LLM proposes, deterministic code disposes. </w:t>
+      </w:r>
+    </w:p>
+    <w:p>
+      <w:pPr>
+        <w:pStyle w:val="BodyText"/>
+        <w:numPr>
+          <w:ilvl w:val="0"/>
+          <w:numId w:val="4"/>
+        </w:numPr>
+        <w:tabs>
+          <w:tab w:val="clear" w:pos="1134"/>
+          <w:tab w:val="left" w:pos="769" w:leader="none"/>
+        </w:tabs>
+        <w:bidi w:val="0"/>
+        <w:ind w:hanging="283" w:left="769"/>
+        <w:jc w:val="left"/>
+        <w:rPr/>
+      </w:pPr>
+      <w:r>
+        <w:rPr>
+          <w:rStyle w:val="Strong"/>
+        </w:rPr>
+        <w:t>Marine safety / HSE analytics:</w:t>
+      </w:r>
+      <w:r>
+        <w:rPr/>
+        <w:t xml:space="preserve"> Built BSEE incident-database analytics (1,987 GoM incidents across failure modes) powering incident-grounded failure-mode reports and seasonal-preparedness studies for offshore operations. </w:t>
       </w:r>
     </w:p>
     <w:p>
@@ -1994,11 +2112,11 @@
         </w:numPr>
         <w:tabs>
           <w:tab w:val="clear" w:pos="1134"/>
-          <w:tab w:val="left" w:pos="754" w:leader="none"/>
-        </w:tabs>
-        <w:bidi w:val="0"/>
-        <w:spacing w:before="45" w:after="0"/>
-        <w:ind w:hanging="283" w:left="754"/>
+          <w:tab w:val="left" w:pos="769" w:leader="none"/>
+        </w:tabs>
+        <w:bidi w:val="0"/>
+        <w:spacing w:before="60" w:after="0"/>
+        <w:ind w:hanging="283" w:left="769"/>
         <w:jc w:val="left"/>
         <w:rPr/>
       </w:pPr>
@@ -2016,11 +2134,11 @@
         </w:numPr>
         <w:tabs>
           <w:tab w:val="clear" w:pos="1134"/>
-          <w:tab w:val="left" w:pos="754" w:leader="none"/>
-        </w:tabs>
-        <w:bidi w:val="0"/>
-        <w:spacing w:before="45" w:after="0"/>
-        <w:ind w:hanging="283" w:left="754"/>
+          <w:tab w:val="left" w:pos="769" w:leader="none"/>
+        </w:tabs>
+        <w:bidi w:val="0"/>
+        <w:spacing w:before="60" w:after="0"/>
+        <w:ind w:hanging="283" w:left="769"/>
         <w:jc w:val="left"/>
         <w:rPr/>
       </w:pPr>
@@ -2044,11 +2162,11 @@
         </w:numPr>
         <w:tabs>
           <w:tab w:val="clear" w:pos="1134"/>
-          <w:tab w:val="left" w:pos="754" w:leader="none"/>
-        </w:tabs>
-        <w:bidi w:val="0"/>
-        <w:spacing w:before="45" w:after="0"/>
-        <w:ind w:hanging="283" w:left="754"/>
+          <w:tab w:val="left" w:pos="769" w:leader="none"/>
+        </w:tabs>
+        <w:bidi w:val="0"/>
+        <w:spacing w:before="60" w:after="0"/>
+        <w:ind w:hanging="283" w:left="769"/>
         <w:jc w:val="left"/>
         <w:rPr/>
       </w:pPr>
@@ -2072,11 +2190,11 @@
         </w:numPr>
         <w:tabs>
           <w:tab w:val="clear" w:pos="1134"/>
-          <w:tab w:val="left" w:pos="754" w:leader="none"/>
-        </w:tabs>
-        <w:bidi w:val="0"/>
-        <w:spacing w:before="45" w:after="0"/>
-        <w:ind w:hanging="283" w:left="754"/>
+          <w:tab w:val="left" w:pos="769" w:leader="none"/>
+        </w:tabs>
+        <w:bidi w:val="0"/>
+        <w:spacing w:before="60" w:after="0"/>
+        <w:ind w:hanging="283" w:left="769"/>
         <w:jc w:val="left"/>
         <w:rPr/>
       </w:pPr>
@@ -2100,10 +2218,10 @@
         </w:numPr>
         <w:tabs>
           <w:tab w:val="clear" w:pos="1134"/>
-          <w:tab w:val="left" w:pos="754" w:leader="none"/>
-        </w:tabs>
-        <w:bidi w:val="0"/>
-        <w:ind w:hanging="283" w:left="754"/>
+          <w:tab w:val="left" w:pos="769" w:leader="none"/>
+        </w:tabs>
+        <w:bidi w:val="0"/>
+        <w:ind w:hanging="283" w:left="769"/>
         <w:jc w:val="left"/>
         <w:rPr/>
       </w:pPr>
@@ -2147,11 +2265,11 @@
         </w:numPr>
         <w:tabs>
           <w:tab w:val="clear" w:pos="1134"/>
-          <w:tab w:val="left" w:pos="754" w:leader="none"/>
-        </w:tabs>
-        <w:bidi w:val="0"/>
-        <w:spacing w:before="45" w:after="0"/>
-        <w:ind w:hanging="283" w:left="754"/>
+          <w:tab w:val="left" w:pos="769" w:leader="none"/>
+        </w:tabs>
+        <w:bidi w:val="0"/>
+        <w:spacing w:before="60" w:after="0"/>
+        <w:ind w:hanging="283" w:left="769"/>
         <w:jc w:val="left"/>
         <w:rPr/>
       </w:pPr>
@@ -2169,11 +2287,11 @@
         </w:numPr>
         <w:tabs>
           <w:tab w:val="clear" w:pos="1134"/>
-          <w:tab w:val="left" w:pos="754" w:leader="none"/>
-        </w:tabs>
-        <w:bidi w:val="0"/>
-        <w:spacing w:before="45" w:after="0"/>
-        <w:ind w:hanging="283" w:left="754"/>
+          <w:tab w:val="left" w:pos="769" w:leader="none"/>
+        </w:tabs>
+        <w:bidi w:val="0"/>
+        <w:spacing w:before="60" w:after="0"/>
+        <w:ind w:hanging="283" w:left="769"/>
         <w:jc w:val="left"/>
         <w:rPr/>
       </w:pPr>
@@ -2197,11 +2315,11 @@
         </w:numPr>
         <w:tabs>
           <w:tab w:val="clear" w:pos="1134"/>
-          <w:tab w:val="left" w:pos="754" w:leader="none"/>
-        </w:tabs>
-        <w:bidi w:val="0"/>
-        <w:spacing w:before="45" w:after="0"/>
-        <w:ind w:hanging="283" w:left="754"/>
+          <w:tab w:val="left" w:pos="769" w:leader="none"/>
+        </w:tabs>
+        <w:bidi w:val="0"/>
+        <w:spacing w:before="60" w:after="0"/>
+        <w:ind w:hanging="283" w:left="769"/>
         <w:jc w:val="left"/>
         <w:rPr/>
       </w:pPr>
@@ -2225,11 +2343,11 @@
         </w:numPr>
         <w:tabs>
           <w:tab w:val="clear" w:pos="1134"/>
-          <w:tab w:val="left" w:pos="754" w:leader="none"/>
-        </w:tabs>
-        <w:bidi w:val="0"/>
-        <w:spacing w:before="45" w:after="0"/>
-        <w:ind w:hanging="283" w:left="754"/>
+          <w:tab w:val="left" w:pos="769" w:leader="none"/>
+        </w:tabs>
+        <w:bidi w:val="0"/>
+        <w:spacing w:before="60" w:after="0"/>
+        <w:ind w:hanging="283" w:left="769"/>
         <w:jc w:val="left"/>
         <w:rPr/>
       </w:pPr>
@@ -2253,11 +2371,11 @@
         </w:numPr>
         <w:tabs>
           <w:tab w:val="clear" w:pos="1134"/>
-          <w:tab w:val="left" w:pos="754" w:leader="none"/>
-        </w:tabs>
-        <w:bidi w:val="0"/>
-        <w:spacing w:before="45" w:after="0"/>
-        <w:ind w:hanging="283" w:left="754"/>
+          <w:tab w:val="left" w:pos="769" w:leader="none"/>
+        </w:tabs>
+        <w:bidi w:val="0"/>
+        <w:spacing w:before="60" w:after="0"/>
+        <w:ind w:hanging="283" w:left="769"/>
         <w:jc w:val="left"/>
         <w:rPr/>
       </w:pPr>
@@ -2281,10 +2399,10 @@
         </w:numPr>
         <w:tabs>
           <w:tab w:val="clear" w:pos="1134"/>
-          <w:tab w:val="left" w:pos="754" w:leader="none"/>
-        </w:tabs>
-        <w:bidi w:val="0"/>
-        <w:ind w:hanging="283" w:left="754"/>
+          <w:tab w:val="left" w:pos="769" w:leader="none"/>
+        </w:tabs>
+        <w:bidi w:val="0"/>
+        <w:ind w:hanging="283" w:left="769"/>
         <w:jc w:val="left"/>
         <w:rPr/>
       </w:pPr>
@@ -2325,11 +2443,11 @@
         </w:numPr>
         <w:tabs>
           <w:tab w:val="clear" w:pos="1134"/>
-          <w:tab w:val="left" w:pos="754" w:leader="none"/>
-        </w:tabs>
-        <w:bidi w:val="0"/>
-        <w:spacing w:before="45" w:after="0"/>
-        <w:ind w:hanging="283" w:left="754"/>
+          <w:tab w:val="left" w:pos="769" w:leader="none"/>
+        </w:tabs>
+        <w:bidi w:val="0"/>
+        <w:spacing w:before="60" w:after="0"/>
+        <w:ind w:hanging="283" w:left="769"/>
         <w:jc w:val="left"/>
         <w:rPr/>
       </w:pPr>
@@ -2353,11 +2471,11 @@
         </w:numPr>
         <w:tabs>
           <w:tab w:val="clear" w:pos="1134"/>
-          <w:tab w:val="left" w:pos="754" w:leader="none"/>
-        </w:tabs>
-        <w:bidi w:val="0"/>
-        <w:spacing w:before="45" w:after="0"/>
-        <w:ind w:hanging="283" w:left="754"/>
+          <w:tab w:val="left" w:pos="769" w:leader="none"/>
+        </w:tabs>
+        <w:bidi w:val="0"/>
+        <w:spacing w:before="60" w:after="0"/>
+        <w:ind w:hanging="283" w:left="769"/>
         <w:jc w:val="left"/>
         <w:rPr/>
       </w:pPr>
@@ -2381,11 +2499,11 @@
         </w:numPr>
         <w:tabs>
           <w:tab w:val="clear" w:pos="1134"/>
-          <w:tab w:val="left" w:pos="754" w:leader="none"/>
-        </w:tabs>
-        <w:bidi w:val="0"/>
-        <w:spacing w:before="45" w:after="0"/>
-        <w:ind w:hanging="283" w:left="754"/>
+          <w:tab w:val="left" w:pos="769" w:leader="none"/>
+        </w:tabs>
+        <w:bidi w:val="0"/>
+        <w:spacing w:before="60" w:after="0"/>
+        <w:ind w:hanging="283" w:left="769"/>
         <w:jc w:val="left"/>
         <w:rPr/>
       </w:pPr>
@@ -2409,11 +2527,11 @@
         </w:numPr>
         <w:tabs>
           <w:tab w:val="clear" w:pos="1134"/>
-          <w:tab w:val="left" w:pos="754" w:leader="none"/>
-        </w:tabs>
-        <w:bidi w:val="0"/>
-        <w:spacing w:before="45" w:after="0"/>
-        <w:ind w:hanging="283" w:left="754"/>
+          <w:tab w:val="left" w:pos="769" w:leader="none"/>
+        </w:tabs>
+        <w:bidi w:val="0"/>
+        <w:spacing w:before="60" w:after="0"/>
+        <w:ind w:hanging="283" w:left="769"/>
         <w:jc w:val="left"/>
         <w:rPr/>
       </w:pPr>
@@ -2437,11 +2555,11 @@
         </w:numPr>
         <w:tabs>
           <w:tab w:val="clear" w:pos="1134"/>
-          <w:tab w:val="left" w:pos="754" w:leader="none"/>
-        </w:tabs>
-        <w:bidi w:val="0"/>
-        <w:spacing w:before="45" w:after="0"/>
-        <w:ind w:hanging="283" w:left="754"/>
+          <w:tab w:val="left" w:pos="769" w:leader="none"/>
+        </w:tabs>
+        <w:bidi w:val="0"/>
+        <w:spacing w:before="60" w:after="0"/>
+        <w:ind w:hanging="283" w:left="769"/>
         <w:jc w:val="left"/>
         <w:rPr/>
       </w:pPr>
@@ -2465,11 +2583,11 @@
         </w:numPr>
         <w:tabs>
           <w:tab w:val="clear" w:pos="1134"/>
-          <w:tab w:val="left" w:pos="754" w:leader="none"/>
-        </w:tabs>
-        <w:bidi w:val="0"/>
-        <w:spacing w:before="45" w:after="0"/>
-        <w:ind w:hanging="283" w:left="754"/>
+          <w:tab w:val="left" w:pos="769" w:leader="none"/>
+        </w:tabs>
+        <w:bidi w:val="0"/>
+        <w:spacing w:before="60" w:after="0"/>
+        <w:ind w:hanging="283" w:left="769"/>
         <w:jc w:val="left"/>
         <w:rPr/>
       </w:pPr>
@@ -2493,11 +2611,11 @@
         </w:numPr>
         <w:tabs>
           <w:tab w:val="clear" w:pos="1134"/>
-          <w:tab w:val="left" w:pos="754" w:leader="none"/>
-        </w:tabs>
-        <w:bidi w:val="0"/>
-        <w:spacing w:before="45" w:after="0"/>
-        <w:ind w:hanging="283" w:left="754"/>
+          <w:tab w:val="left" w:pos="769" w:leader="none"/>
+        </w:tabs>
+        <w:bidi w:val="0"/>
+        <w:spacing w:before="60" w:after="0"/>
+        <w:ind w:hanging="283" w:left="769"/>
         <w:jc w:val="left"/>
         <w:rPr/>
       </w:pPr>
@@ -2521,10 +2639,51 @@
         </w:numPr>
         <w:tabs>
           <w:tab w:val="clear" w:pos="1134"/>
-          <w:tab w:val="left" w:pos="754" w:leader="none"/>
-        </w:tabs>
-        <w:bidi w:val="0"/>
-        <w:ind w:hanging="283" w:left="754"/>
+          <w:tab w:val="left" w:pos="769" w:leader="none"/>
+        </w:tabs>
+        <w:bidi w:val="0"/>
+        <w:spacing w:before="60" w:after="0"/>
+        <w:ind w:hanging="283" w:left="769"/>
+        <w:jc w:val="left"/>
+        <w:rPr/>
+      </w:pPr>
+      <w:r>
+        <w:rPr>
+          <w:rStyle w:val="Strong"/>
+        </w:rPr>
+        <w:t>Deckhand (live demos):</w:t>
+      </w:r>
+      <w:r>
+        <w:rPr/>
+        <w:t xml:space="preserve"> API-first deterministic engineering-workflows platform — </w:t>
+      </w:r>
+      <w:hyperlink r:id="rId15">
+        <w:r>
+          <w:rPr>
+            <w:rStyle w:val="Hyperlink"/>
+          </w:rPr>
+          <w:t>public demo gallery</w:t>
+        </w:r>
+      </w:hyperlink>
+      <w:r>
+        <w:rPr/>
+        <w:t xml:space="preserve"> with grounded, provenance-traced analysis cards. </w:t>
+      </w:r>
+    </w:p>
+    <w:p>
+      <w:pPr>
+        <w:pStyle w:val="BodyText"/>
+        <w:numPr>
+          <w:ilvl w:val="0"/>
+          <w:numId w:val="7"/>
+        </w:numPr>
+        <w:tabs>
+          <w:tab w:val="clear" w:pos="1134"/>
+          <w:tab w:val="left" w:pos="769" w:leader="none"/>
+        </w:tabs>
+        <w:bidi w:val="0"/>
+        <w:spacing w:before="60" w:after="0"/>
+        <w:ind w:hanging="283" w:left="769"/>
         <w:jc w:val="left"/>
         <w:rPr/>
       </w:pPr>
@@ -2541,6 +2700,33 @@
     </w:p>
     <w:p>
       <w:pPr>
+        <w:pStyle w:val="BodyText"/>
+        <w:numPr>
+          <w:ilvl w:val="0"/>
+          <w:numId w:val="7"/>
+        </w:numPr>
+        <w:tabs>
+          <w:tab w:val="clear" w:pos="1134"/>
+          <w:tab w:val="left" w:pos="769" w:leader="none"/>
+        </w:tabs>
+        <w:bidi w:val="0"/>
+        <w:ind w:hanging="283" w:left="769"/>
+        <w:jc w:val="left"/>
+        <w:rPr/>
+      </w:pPr>
+      <w:r>
+        <w:rPr>
+          <w:rStyle w:val="Strong"/>
+        </w:rPr>
+        <w:t>CFD validation suite (open):</w:t>
+      </w:r>
+      <w:r>
+        <w:rPr/>
+        <w:t xml:space="preserve"> OpenFOAM benchmarks validated against canonical solutions — Blasius flat plate, cylinder Re=100 vortex shedding, NACA0012, dam-break VOF — with live published reports in digitalmodel. </w:t>
+      </w:r>
+    </w:p>
+    <w:p>
+      <w:pPr>
         <w:pStyle w:val="Heading2"/>
         <w:bidi w:val="0"/>
         <w:jc w:val="left"/>
@@ -2560,11 +2746,11 @@
         </w:numPr>
         <w:tabs>
           <w:tab w:val="clear" w:pos="1134"/>
-          <w:tab w:val="left" w:pos="754" w:leader="none"/>
-        </w:tabs>
-        <w:bidi w:val="0"/>
-        <w:spacing w:before="45" w:after="0"/>
-        <w:ind w:hanging="283" w:left="754"/>
+          <w:tab w:val="left" w:pos="769" w:leader="none"/>
+        </w:tabs>
+        <w:bidi w:val="0"/>
+        <w:spacing w:before="60" w:after="0"/>
+        <w:ind w:hanging="283" w:left="769"/>
         <w:jc w:val="left"/>
         <w:rPr/>
       </w:pPr>
@@ -2588,11 +2774,11 @@
         </w:numPr>
         <w:tabs>
           <w:tab w:val="clear" w:pos="1134"/>
-          <w:tab w:val="left" w:pos="754" w:leader="none"/>
-        </w:tabs>
-        <w:bidi w:val="0"/>
-        <w:spacing w:before="45" w:after="0"/>
-        <w:ind w:hanging="283" w:left="754"/>
+          <w:tab w:val="left" w:pos="769" w:leader="none"/>
+        </w:tabs>
+        <w:bidi w:val="0"/>
+        <w:spacing w:before="60" w:after="0"/>
+        <w:ind w:hanging="283" w:left="769"/>
         <w:jc w:val="left"/>
         <w:rPr/>
       </w:pPr>
@@ -2616,11 +2802,11 @@
         </w:numPr>
         <w:tabs>
           <w:tab w:val="clear" w:pos="1134"/>
-          <w:tab w:val="left" w:pos="754" w:leader="none"/>
-        </w:tabs>
-        <w:bidi w:val="0"/>
-        <w:spacing w:before="45" w:after="0"/>
-        <w:ind w:hanging="283" w:left="754"/>
+          <w:tab w:val="left" w:pos="769" w:leader="none"/>
+        </w:tabs>
+        <w:bidi w:val="0"/>
+        <w:spacing w:before="60" w:after="0"/>
+        <w:ind w:hanging="283" w:left="769"/>
         <w:jc w:val="left"/>
         <w:rPr/>
       </w:pPr>
@@ -2654,11 +2840,11 @@
         </w:numPr>
         <w:tabs>
           <w:tab w:val="clear" w:pos="1134"/>
-          <w:tab w:val="left" w:pos="754" w:leader="none"/>
-        </w:tabs>
-        <w:bidi w:val="0"/>
-        <w:spacing w:before="45" w:after="0"/>
-        <w:ind w:hanging="283" w:left="754"/>
+          <w:tab w:val="left" w:pos="769" w:leader="none"/>
+        </w:tabs>
+        <w:bidi w:val="0"/>
+        <w:spacing w:before="60" w:after="0"/>
+        <w:ind w:hanging="283" w:left="769"/>
         <w:jc w:val="left"/>
         <w:rPr/>
       </w:pPr>
@@ -2682,10 +2868,10 @@
         </w:numPr>
         <w:tabs>
           <w:tab w:val="clear" w:pos="1134"/>
-          <w:tab w:val="left" w:pos="754" w:leader="none"/>
-        </w:tabs>
-        <w:bidi w:val="0"/>
-        <w:ind w:hanging="283" w:left="754"/>
+          <w:tab w:val="left" w:pos="769" w:leader="none"/>
+        </w:tabs>
+        <w:bidi w:val="0"/>
+        <w:ind w:hanging="283" w:left="769"/>
         <w:jc w:val="left"/>
         <w:rPr/>
       </w:pPr>
@@ -2764,7 +2950,7 @@
       <w:pPr>
         <w:pStyle w:val="BodyText"/>
         <w:bidi w:val="0"/>
-        <w:spacing w:before="45" w:after="75"/>
+        <w:spacing w:before="60" w:after="60"/>
         <w:jc w:val="left"/>
         <w:rPr/>
       </w:pPr>
@@ -4292,8 +4478,8 @@
     <w:name w:val="Body Text"/>
     <w:basedOn w:val="Normal"/>
     <w:pPr>
-      <w:spacing w:before="45" w:after="75"/>
-      <w:ind w:left="45" w:right="45"/>
+      <w:spacing w:before="60" w:after="60"/>
+      <w:ind w:left="60" w:right="60"/>
     </w:pPr>
     <w:rPr/>
   </w:style>

</xml_diff>